<commit_message>
Document dashboard functions and practical applications
</commit_message>
<xml_diff>
--- a/docs/reports/FaultNet-partial-report.docx
+++ b/docs/reports/FaultNet-partial-report.docx
@@ -180,13 +180,7 @@
         <w:t xml:space="preserve"> under the supervision of </w:t>
       </w:r>
       <w:r>
-        <w:t>Dr.</w:t>
-      </w:r>
-      <w:r>
-        <w:t xml:space="preserve"> S. Ebenezer</w:t>
-      </w:r>
-      <w:r>
-        <w:t xml:space="preserve"> Juliet.</w:t>
+        <w:t>Dr. S. Ebenezer Juliet.</w:t>
       </w:r>
     </w:p>
     <w:p>
@@ -280,7 +274,7 @@
       <w:r>
         <w:fldChar w:fldCharType="separate"/>
       </w:r>
-      <w:hyperlink w:anchor="_Toc242904049" w:history="1">
+      <w:hyperlink w:anchor="_Toc242906119" w:history="1">
         <w:r>
           <w:rPr>
             <w:rStyle w:val="Hyperlink"/>
@@ -307,7 +301,78 @@
             <w:noProof/>
             <w:webHidden/>
           </w:rPr>
-          <w:instrText xml:space="preserve"> PAGEREF _Toc242904049 \h </w:instrText>
+          <w:instrText xml:space="preserve"> PAGEREF _Toc242906119 \h </w:instrText>
+        </w:r>
+        <w:r>
+          <w:rPr>
+            <w:noProof/>
+            <w:webHidden/>
+          </w:rPr>
+        </w:r>
+        <w:r>
+          <w:rPr>
+            <w:noProof/>
+            <w:webHidden/>
+          </w:rPr>
+          <w:fldChar w:fldCharType="separate"/>
+        </w:r>
+        <w:r>
+          <w:rPr>
+            <w:noProof/>
+            <w:webHidden/>
+          </w:rPr>
+          <w:t>4</w:t>
+        </w:r>
+        <w:r>
+          <w:rPr>
+            <w:noProof/>
+            <w:webHidden/>
+          </w:rPr>
+          <w:fldChar w:fldCharType="end"/>
+        </w:r>
+      </w:hyperlink>
+    </w:p>
+    <w:p>
+      <w:pPr>
+        <w:pStyle w:val="TOC2"/>
+        <w:rPr>
+          <w:rFonts w:asciiTheme="minorHAnsi" w:hAnsiTheme="minorHAnsi" w:cstheme="minorBidi"/>
+          <w:noProof/>
+          <w:color w:val="auto"/>
+          <w:kern w:val="2"/>
+          <w:sz w:val="24"/>
+          <w:szCs w:val="24"/>
+          <w14:ligatures w14:val="standardContextual"/>
+        </w:rPr>
+      </w:pPr>
+      <w:hyperlink w:anchor="_Toc242906120" w:history="1">
+        <w:r>
+          <w:rPr>
+            <w:rStyle w:val="Hyperlink"/>
+            <w:noProof/>
+          </w:rPr>
+          <w:t>1.1 Practical Applications</w:t>
+        </w:r>
+        <w:r>
+          <w:rPr>
+            <w:noProof/>
+            <w:webHidden/>
+          </w:rPr>
+          <w:tab/>
+        </w:r>
+        <w:r>
+          <w:rPr>
+            <w:noProof/>
+            <w:webHidden/>
+          </w:rPr>
+          <w:fldChar w:fldCharType="begin"/>
+        </w:r>
+        <w:r>
+          <w:rPr>
+            <w:noProof/>
+            <w:webHidden/>
+          </w:rPr>
+          <w:instrText xml:space="preserve"> PAGEREF _Toc242906120 \h </w:instrText>
         </w:r>
         <w:r>
           <w:rPr>
@@ -351,7 +416,7 @@
           <w14:ligatures w14:val="standardContextual"/>
         </w:rPr>
       </w:pPr>
-      <w:hyperlink w:anchor="_Toc242904050" w:history="1">
+      <w:hyperlink w:anchor="_Toc242906121" w:history="1">
         <w:r>
           <w:rPr>
             <w:rStyle w:val="Hyperlink"/>
@@ -378,7 +443,7 @@
             <w:noProof/>
             <w:webHidden/>
           </w:rPr>
-          <w:instrText xml:space="preserve"> PAGEREF _Toc242904050 \h </w:instrText>
+          <w:instrText xml:space="preserve"> PAGEREF _Toc242906121 \h </w:instrText>
         </w:r>
         <w:r>
           <w:rPr>
@@ -422,7 +487,7 @@
           <w14:ligatures w14:val="standardContextual"/>
         </w:rPr>
       </w:pPr>
-      <w:hyperlink w:anchor="_Toc242904051" w:history="1">
+      <w:hyperlink w:anchor="_Toc242906122" w:history="1">
         <w:r>
           <w:rPr>
             <w:rStyle w:val="Hyperlink"/>
@@ -449,7 +514,7 @@
             <w:noProof/>
             <w:webHidden/>
           </w:rPr>
-          <w:instrText xml:space="preserve"> PAGEREF _Toc242904051 \h </w:instrText>
+          <w:instrText xml:space="preserve"> PAGEREF _Toc242906122 \h </w:instrText>
         </w:r>
         <w:r>
           <w:rPr>
@@ -493,7 +558,7 @@
           <w14:ligatures w14:val="standardContextual"/>
         </w:rPr>
       </w:pPr>
-      <w:hyperlink w:anchor="_Toc242904052" w:history="1">
+      <w:hyperlink w:anchor="_Toc242906123" w:history="1">
         <w:r>
           <w:rPr>
             <w:rStyle w:val="Hyperlink"/>
@@ -520,7 +585,7 @@
             <w:noProof/>
             <w:webHidden/>
           </w:rPr>
-          <w:instrText xml:space="preserve"> PAGEREF _Toc242904052 \h </w:instrText>
+          <w:instrText xml:space="preserve"> PAGEREF _Toc242906123 \h </w:instrText>
         </w:r>
         <w:r>
           <w:rPr>
@@ -564,7 +629,7 @@
           <w14:ligatures w14:val="standardContextual"/>
         </w:rPr>
       </w:pPr>
-      <w:hyperlink w:anchor="_Toc242904053" w:history="1">
+      <w:hyperlink w:anchor="_Toc242906124" w:history="1">
         <w:r>
           <w:rPr>
             <w:rStyle w:val="Hyperlink"/>
@@ -591,7 +656,7 @@
             <w:noProof/>
             <w:webHidden/>
           </w:rPr>
-          <w:instrText xml:space="preserve"> PAGEREF _Toc242904053 \h </w:instrText>
+          <w:instrText xml:space="preserve"> PAGEREF _Toc242906124 \h </w:instrText>
         </w:r>
         <w:r>
           <w:rPr>
@@ -635,7 +700,7 @@
           <w14:ligatures w14:val="standardContextual"/>
         </w:rPr>
       </w:pPr>
-      <w:hyperlink w:anchor="_Toc242904054" w:history="1">
+      <w:hyperlink w:anchor="_Toc242906125" w:history="1">
         <w:r>
           <w:rPr>
             <w:rStyle w:val="Hyperlink"/>
@@ -662,7 +727,7 @@
             <w:noProof/>
             <w:webHidden/>
           </w:rPr>
-          <w:instrText xml:space="preserve"> PAGEREF _Toc242904054 \h </w:instrText>
+          <w:instrText xml:space="preserve"> PAGEREF _Toc242906125 \h </w:instrText>
         </w:r>
         <w:r>
           <w:rPr>
@@ -695,7 +760,7 @@
     </w:p>
     <w:p>
       <w:pPr>
-        <w:pStyle w:val="TOC1"/>
+        <w:pStyle w:val="TOC2"/>
         <w:rPr>
           <w:rFonts w:asciiTheme="minorHAnsi" w:hAnsiTheme="minorHAnsi" w:cstheme="minorBidi"/>
           <w:noProof/>
@@ -706,13 +771,13 @@
           <w14:ligatures w14:val="standardContextual"/>
         </w:rPr>
       </w:pPr>
-      <w:hyperlink w:anchor="_Toc242904055" w:history="1">
+      <w:hyperlink w:anchor="_Toc242906126" w:history="1">
         <w:r>
           <w:rPr>
             <w:rStyle w:val="Hyperlink"/>
             <w:noProof/>
           </w:rPr>
-          <w:t>7. Modules Explanation</w:t>
+          <w:t>6.1 Dashboard Roles and Separation</w:t>
         </w:r>
         <w:r>
           <w:rPr>
@@ -733,7 +798,7 @@
             <w:noProof/>
             <w:webHidden/>
           </w:rPr>
-          <w:instrText xml:space="preserve"> PAGEREF _Toc242904055 \h </w:instrText>
+          <w:instrText xml:space="preserve"> PAGEREF _Toc242906126 \h </w:instrText>
         </w:r>
         <w:r>
           <w:rPr>
@@ -766,7 +831,7 @@
     </w:p>
     <w:p>
       <w:pPr>
-        <w:pStyle w:val="TOC1"/>
+        <w:pStyle w:val="TOC2"/>
         <w:rPr>
           <w:rFonts w:asciiTheme="minorHAnsi" w:hAnsiTheme="minorHAnsi" w:cstheme="minorBidi"/>
           <w:noProof/>
@@ -777,13 +842,13 @@
           <w14:ligatures w14:val="standardContextual"/>
         </w:rPr>
       </w:pPr>
-      <w:hyperlink w:anchor="_Toc242904056" w:history="1">
+      <w:hyperlink w:anchor="_Toc242906127" w:history="1">
         <w:r>
           <w:rPr>
             <w:rStyle w:val="Hyperlink"/>
             <w:noProof/>
           </w:rPr>
-          <w:t>8. Project Implementation</w:t>
+          <w:t>6.2 Experiment Workbench Functions</w:t>
         </w:r>
         <w:r>
           <w:rPr>
@@ -804,7 +869,7 @@
             <w:noProof/>
             <w:webHidden/>
           </w:rPr>
-          <w:instrText xml:space="preserve"> PAGEREF _Toc242904056 \h </w:instrText>
+          <w:instrText xml:space="preserve"> PAGEREF _Toc242906127 \h </w:instrText>
         </w:r>
         <w:r>
           <w:rPr>
@@ -848,13 +913,13 @@
           <w14:ligatures w14:val="standardContextual"/>
         </w:rPr>
       </w:pPr>
-      <w:hyperlink w:anchor="_Toc242904057" w:history="1">
+      <w:hyperlink w:anchor="_Toc242906128" w:history="1">
         <w:r>
           <w:rPr>
             <w:rStyle w:val="Hyperlink"/>
             <w:noProof/>
           </w:rPr>
-          <w:t>8.1 Experimental Setup and Requirements</w:t>
+          <w:t>6.3 Live Proxy Cockpit Functions</w:t>
         </w:r>
         <w:r>
           <w:rPr>
@@ -875,149 +940,7 @@
             <w:noProof/>
             <w:webHidden/>
           </w:rPr>
-          <w:instrText xml:space="preserve"> PAGEREF _Toc242904057 \h </w:instrText>
-        </w:r>
-        <w:r>
-          <w:rPr>
-            <w:noProof/>
-            <w:webHidden/>
-          </w:rPr>
-        </w:r>
-        <w:r>
-          <w:rPr>
-            <w:noProof/>
-            <w:webHidden/>
-          </w:rPr>
-          <w:fldChar w:fldCharType="separate"/>
-        </w:r>
-        <w:r>
-          <w:rPr>
-            <w:noProof/>
-            <w:webHidden/>
-          </w:rPr>
-          <w:t>8</w:t>
-        </w:r>
-        <w:r>
-          <w:rPr>
-            <w:noProof/>
-            <w:webHidden/>
-          </w:rPr>
-          <w:fldChar w:fldCharType="end"/>
-        </w:r>
-      </w:hyperlink>
-    </w:p>
-    <w:p>
-      <w:pPr>
-        <w:pStyle w:val="TOC2"/>
-        <w:rPr>
-          <w:rFonts w:asciiTheme="minorHAnsi" w:hAnsiTheme="minorHAnsi" w:cstheme="minorBidi"/>
-          <w:noProof/>
-          <w:color w:val="auto"/>
-          <w:kern w:val="2"/>
-          <w:sz w:val="24"/>
-          <w:szCs w:val="24"/>
-          <w14:ligatures w14:val="standardContextual"/>
-        </w:rPr>
-      </w:pPr>
-      <w:hyperlink w:anchor="_Toc242904058" w:history="1">
-        <w:r>
-          <w:rPr>
-            <w:rStyle w:val="Hyperlink"/>
-            <w:noProof/>
-          </w:rPr>
-          <w:t>8.2 Test Cases</w:t>
-        </w:r>
-        <w:r>
-          <w:rPr>
-            <w:noProof/>
-            <w:webHidden/>
-          </w:rPr>
-          <w:tab/>
-        </w:r>
-        <w:r>
-          <w:rPr>
-            <w:noProof/>
-            <w:webHidden/>
-          </w:rPr>
-          <w:fldChar w:fldCharType="begin"/>
-        </w:r>
-        <w:r>
-          <w:rPr>
-            <w:noProof/>
-            <w:webHidden/>
-          </w:rPr>
-          <w:instrText xml:space="preserve"> PAGEREF _Toc242904058 \h </w:instrText>
-        </w:r>
-        <w:r>
-          <w:rPr>
-            <w:noProof/>
-            <w:webHidden/>
-          </w:rPr>
-        </w:r>
-        <w:r>
-          <w:rPr>
-            <w:noProof/>
-            <w:webHidden/>
-          </w:rPr>
-          <w:fldChar w:fldCharType="separate"/>
-        </w:r>
-        <w:r>
-          <w:rPr>
-            <w:noProof/>
-            <w:webHidden/>
-          </w:rPr>
-          <w:t>8</w:t>
-        </w:r>
-        <w:r>
-          <w:rPr>
-            <w:noProof/>
-            <w:webHidden/>
-          </w:rPr>
-          <w:fldChar w:fldCharType="end"/>
-        </w:r>
-      </w:hyperlink>
-    </w:p>
-    <w:p>
-      <w:pPr>
-        <w:pStyle w:val="TOC2"/>
-        <w:rPr>
-          <w:rFonts w:asciiTheme="minorHAnsi" w:hAnsiTheme="minorHAnsi" w:cstheme="minorBidi"/>
-          <w:noProof/>
-          <w:color w:val="auto"/>
-          <w:kern w:val="2"/>
-          <w:sz w:val="24"/>
-          <w:szCs w:val="24"/>
-          <w14:ligatures w14:val="standardContextual"/>
-        </w:rPr>
-      </w:pPr>
-      <w:hyperlink w:anchor="_Toc242904059" w:history="1">
-        <w:r>
-          <w:rPr>
-            <w:rStyle w:val="Hyperlink"/>
-            <w:noProof/>
-          </w:rPr>
-          <w:t>8.3 Execution Results</w:t>
-        </w:r>
-        <w:r>
-          <w:rPr>
-            <w:noProof/>
-            <w:webHidden/>
-          </w:rPr>
-          <w:tab/>
-        </w:r>
-        <w:r>
-          <w:rPr>
-            <w:noProof/>
-            <w:webHidden/>
-          </w:rPr>
-          <w:fldChar w:fldCharType="begin"/>
-        </w:r>
-        <w:r>
-          <w:rPr>
-            <w:noProof/>
-            <w:webHidden/>
-          </w:rPr>
-          <w:instrText xml:space="preserve"> PAGEREF _Toc242904059 \h </w:instrText>
+          <w:instrText xml:space="preserve"> PAGEREF _Toc242906128 \h </w:instrText>
         </w:r>
         <w:r>
           <w:rPr>
@@ -1050,7 +973,7 @@
     </w:p>
     <w:p>
       <w:pPr>
-        <w:pStyle w:val="TOC2"/>
+        <w:pStyle w:val="TOC1"/>
         <w:rPr>
           <w:rFonts w:asciiTheme="minorHAnsi" w:hAnsiTheme="minorHAnsi" w:cstheme="minorBidi"/>
           <w:noProof/>
@@ -1061,13 +984,13 @@
           <w14:ligatures w14:val="standardContextual"/>
         </w:rPr>
       </w:pPr>
-      <w:hyperlink w:anchor="_Toc242904060" w:history="1">
+      <w:hyperlink w:anchor="_Toc242906129" w:history="1">
         <w:r>
           <w:rPr>
             <w:rStyle w:val="Hyperlink"/>
             <w:noProof/>
           </w:rPr>
-          <w:t>8.4 Performance Analysis and Routing Comparison</w:t>
+          <w:t>7. Modules Explanation</w:t>
         </w:r>
         <w:r>
           <w:rPr>
@@ -1088,78 +1011,7 @@
             <w:noProof/>
             <w:webHidden/>
           </w:rPr>
-          <w:instrText xml:space="preserve"> PAGEREF _Toc242904060 \h </w:instrText>
-        </w:r>
-        <w:r>
-          <w:rPr>
-            <w:noProof/>
-            <w:webHidden/>
-          </w:rPr>
-        </w:r>
-        <w:r>
-          <w:rPr>
-            <w:noProof/>
-            <w:webHidden/>
-          </w:rPr>
-          <w:fldChar w:fldCharType="separate"/>
-        </w:r>
-        <w:r>
-          <w:rPr>
-            <w:noProof/>
-            <w:webHidden/>
-          </w:rPr>
-          <w:t>10</w:t>
-        </w:r>
-        <w:r>
-          <w:rPr>
-            <w:noProof/>
-            <w:webHidden/>
-          </w:rPr>
-          <w:fldChar w:fldCharType="end"/>
-        </w:r>
-      </w:hyperlink>
-    </w:p>
-    <w:p>
-      <w:pPr>
-        <w:pStyle w:val="TOC2"/>
-        <w:rPr>
-          <w:rFonts w:asciiTheme="minorHAnsi" w:hAnsiTheme="minorHAnsi" w:cstheme="minorBidi"/>
-          <w:noProof/>
-          <w:color w:val="auto"/>
-          <w:kern w:val="2"/>
-          <w:sz w:val="24"/>
-          <w:szCs w:val="24"/>
-          <w14:ligatures w14:val="standardContextual"/>
-        </w:rPr>
-      </w:pPr>
-      <w:hyperlink w:anchor="_Toc242904061" w:history="1">
-        <w:r>
-          <w:rPr>
-            <w:rStyle w:val="Hyperlink"/>
-            <w:noProof/>
-          </w:rPr>
-          <w:t>8.5 Critical Evaluation and Optimization</w:t>
-        </w:r>
-        <w:r>
-          <w:rPr>
-            <w:noProof/>
-            <w:webHidden/>
-          </w:rPr>
-          <w:tab/>
-        </w:r>
-        <w:r>
-          <w:rPr>
-            <w:noProof/>
-            <w:webHidden/>
-          </w:rPr>
-          <w:fldChar w:fldCharType="begin"/>
-        </w:r>
-        <w:r>
-          <w:rPr>
-            <w:noProof/>
-            <w:webHidden/>
-          </w:rPr>
-          <w:instrText xml:space="preserve"> PAGEREF _Toc242904061 \h </w:instrText>
+          <w:instrText xml:space="preserve"> PAGEREF _Toc242906129 \h </w:instrText>
         </w:r>
         <w:r>
           <w:rPr>
@@ -1203,13 +1055,13 @@
           <w14:ligatures w14:val="standardContextual"/>
         </w:rPr>
       </w:pPr>
-      <w:hyperlink w:anchor="_Toc242904062" w:history="1">
+      <w:hyperlink w:anchor="_Toc242906130" w:history="1">
         <w:r>
           <w:rPr>
             <w:rStyle w:val="Hyperlink"/>
             <w:noProof/>
           </w:rPr>
-          <w:t>9. Results and Discussion</w:t>
+          <w:t>8. Project Implementation</w:t>
         </w:r>
         <w:r>
           <w:rPr>
@@ -1230,7 +1082,7 @@
             <w:noProof/>
             <w:webHidden/>
           </w:rPr>
-          <w:instrText xml:space="preserve"> PAGEREF _Toc242904062 \h </w:instrText>
+          <w:instrText xml:space="preserve"> PAGEREF _Toc242906130 \h </w:instrText>
         </w:r>
         <w:r>
           <w:rPr>
@@ -1274,13 +1126,13 @@
           <w14:ligatures w14:val="standardContextual"/>
         </w:rPr>
       </w:pPr>
-      <w:hyperlink w:anchor="_Toc242904063" w:history="1">
+      <w:hyperlink w:anchor="_Toc242906131" w:history="1">
         <w:r>
           <w:rPr>
             <w:rStyle w:val="Hyperlink"/>
             <w:noProof/>
           </w:rPr>
-          <w:t>9.1 Findings and Inferences</w:t>
+          <w:t>8.1 Experimental Setup and Requirements</w:t>
         </w:r>
         <w:r>
           <w:rPr>
@@ -1301,7 +1153,7 @@
             <w:noProof/>
             <w:webHidden/>
           </w:rPr>
-          <w:instrText xml:space="preserve"> PAGEREF _Toc242904063 \h </w:instrText>
+          <w:instrText xml:space="preserve"> PAGEREF _Toc242906131 \h </w:instrText>
         </w:r>
         <w:r>
           <w:rPr>
@@ -1345,13 +1197,13 @@
           <w14:ligatures w14:val="standardContextual"/>
         </w:rPr>
       </w:pPr>
-      <w:hyperlink w:anchor="_Toc242904064" w:history="1">
+      <w:hyperlink w:anchor="_Toc242906132" w:history="1">
         <w:r>
           <w:rPr>
             <w:rStyle w:val="Hyperlink"/>
             <w:noProof/>
           </w:rPr>
-          <w:t>9.2 Innovation and Evidence</w:t>
+          <w:t>8.2 Test Cases</w:t>
         </w:r>
         <w:r>
           <w:rPr>
@@ -1372,7 +1224,7 @@
             <w:noProof/>
             <w:webHidden/>
           </w:rPr>
-          <w:instrText xml:space="preserve"> PAGEREF _Toc242904064 \h </w:instrText>
+          <w:instrText xml:space="preserve"> PAGEREF _Toc242906132 \h </w:instrText>
         </w:r>
         <w:r>
           <w:rPr>
@@ -1405,6 +1257,219 @@
     </w:p>
     <w:p>
       <w:pPr>
+        <w:pStyle w:val="TOC2"/>
+        <w:rPr>
+          <w:rFonts w:asciiTheme="minorHAnsi" w:hAnsiTheme="minorHAnsi" w:cstheme="minorBidi"/>
+          <w:noProof/>
+          <w:color w:val="auto"/>
+          <w:kern w:val="2"/>
+          <w:sz w:val="24"/>
+          <w:szCs w:val="24"/>
+          <w14:ligatures w14:val="standardContextual"/>
+        </w:rPr>
+      </w:pPr>
+      <w:hyperlink w:anchor="_Toc242906133" w:history="1">
+        <w:r>
+          <w:rPr>
+            <w:rStyle w:val="Hyperlink"/>
+            <w:noProof/>
+          </w:rPr>
+          <w:t>8.3 Execution Results</w:t>
+        </w:r>
+        <w:r>
+          <w:rPr>
+            <w:noProof/>
+            <w:webHidden/>
+          </w:rPr>
+          <w:tab/>
+        </w:r>
+        <w:r>
+          <w:rPr>
+            <w:noProof/>
+            <w:webHidden/>
+          </w:rPr>
+          <w:fldChar w:fldCharType="begin"/>
+        </w:r>
+        <w:r>
+          <w:rPr>
+            <w:noProof/>
+            <w:webHidden/>
+          </w:rPr>
+          <w:instrText xml:space="preserve"> PAGEREF _Toc242906133 \h </w:instrText>
+        </w:r>
+        <w:r>
+          <w:rPr>
+            <w:noProof/>
+            <w:webHidden/>
+          </w:rPr>
+        </w:r>
+        <w:r>
+          <w:rPr>
+            <w:noProof/>
+            <w:webHidden/>
+          </w:rPr>
+          <w:fldChar w:fldCharType="separate"/>
+        </w:r>
+        <w:r>
+          <w:rPr>
+            <w:noProof/>
+            <w:webHidden/>
+          </w:rPr>
+          <w:t>12</w:t>
+        </w:r>
+        <w:r>
+          <w:rPr>
+            <w:noProof/>
+            <w:webHidden/>
+          </w:rPr>
+          <w:fldChar w:fldCharType="end"/>
+        </w:r>
+      </w:hyperlink>
+    </w:p>
+    <w:p>
+      <w:pPr>
+        <w:pStyle w:val="TOC2"/>
+        <w:rPr>
+          <w:rFonts w:asciiTheme="minorHAnsi" w:hAnsiTheme="minorHAnsi" w:cstheme="minorBidi"/>
+          <w:noProof/>
+          <w:color w:val="auto"/>
+          <w:kern w:val="2"/>
+          <w:sz w:val="24"/>
+          <w:szCs w:val="24"/>
+          <w14:ligatures w14:val="standardContextual"/>
+        </w:rPr>
+      </w:pPr>
+      <w:hyperlink w:anchor="_Toc242906134" w:history="1">
+        <w:r>
+          <w:rPr>
+            <w:rStyle w:val="Hyperlink"/>
+            <w:noProof/>
+          </w:rPr>
+          <w:t>8.4 Performance Analysis and Routing Comparison</w:t>
+        </w:r>
+        <w:r>
+          <w:rPr>
+            <w:noProof/>
+            <w:webHidden/>
+          </w:rPr>
+          <w:tab/>
+        </w:r>
+        <w:r>
+          <w:rPr>
+            <w:noProof/>
+            <w:webHidden/>
+          </w:rPr>
+          <w:fldChar w:fldCharType="begin"/>
+        </w:r>
+        <w:r>
+          <w:rPr>
+            <w:noProof/>
+            <w:webHidden/>
+          </w:rPr>
+          <w:instrText xml:space="preserve"> PAGEREF _Toc242906134 \h </w:instrText>
+        </w:r>
+        <w:r>
+          <w:rPr>
+            <w:noProof/>
+            <w:webHidden/>
+          </w:rPr>
+        </w:r>
+        <w:r>
+          <w:rPr>
+            <w:noProof/>
+            <w:webHidden/>
+          </w:rPr>
+          <w:fldChar w:fldCharType="separate"/>
+        </w:r>
+        <w:r>
+          <w:rPr>
+            <w:noProof/>
+            <w:webHidden/>
+          </w:rPr>
+          <w:t>13</w:t>
+        </w:r>
+        <w:r>
+          <w:rPr>
+            <w:noProof/>
+            <w:webHidden/>
+          </w:rPr>
+          <w:fldChar w:fldCharType="end"/>
+        </w:r>
+      </w:hyperlink>
+    </w:p>
+    <w:p>
+      <w:pPr>
+        <w:pStyle w:val="TOC2"/>
+        <w:rPr>
+          <w:rFonts w:asciiTheme="minorHAnsi" w:hAnsiTheme="minorHAnsi" w:cstheme="minorBidi"/>
+          <w:noProof/>
+          <w:color w:val="auto"/>
+          <w:kern w:val="2"/>
+          <w:sz w:val="24"/>
+          <w:szCs w:val="24"/>
+          <w14:ligatures w14:val="standardContextual"/>
+        </w:rPr>
+      </w:pPr>
+      <w:hyperlink w:anchor="_Toc242906135" w:history="1">
+        <w:r>
+          <w:rPr>
+            <w:rStyle w:val="Hyperlink"/>
+            <w:noProof/>
+          </w:rPr>
+          <w:t>8.5 Critical Evaluation and Optimization</w:t>
+        </w:r>
+        <w:r>
+          <w:rPr>
+            <w:noProof/>
+            <w:webHidden/>
+          </w:rPr>
+          <w:tab/>
+        </w:r>
+        <w:r>
+          <w:rPr>
+            <w:noProof/>
+            <w:webHidden/>
+          </w:rPr>
+          <w:fldChar w:fldCharType="begin"/>
+        </w:r>
+        <w:r>
+          <w:rPr>
+            <w:noProof/>
+            <w:webHidden/>
+          </w:rPr>
+          <w:instrText xml:space="preserve"> PAGEREF _Toc242906135 \h </w:instrText>
+        </w:r>
+        <w:r>
+          <w:rPr>
+            <w:noProof/>
+            <w:webHidden/>
+          </w:rPr>
+        </w:r>
+        <w:r>
+          <w:rPr>
+            <w:noProof/>
+            <w:webHidden/>
+          </w:rPr>
+          <w:fldChar w:fldCharType="separate"/>
+        </w:r>
+        <w:r>
+          <w:rPr>
+            <w:noProof/>
+            <w:webHidden/>
+          </w:rPr>
+          <w:t>13</w:t>
+        </w:r>
+        <w:r>
+          <w:rPr>
+            <w:noProof/>
+            <w:webHidden/>
+          </w:rPr>
+          <w:fldChar w:fldCharType="end"/>
+        </w:r>
+      </w:hyperlink>
+    </w:p>
+    <w:p>
+      <w:pPr>
         <w:pStyle w:val="TOC1"/>
         <w:rPr>
           <w:rFonts w:asciiTheme="minorHAnsi" w:hAnsiTheme="minorHAnsi" w:cstheme="minorBidi"/>
@@ -1416,7 +1481,228 @@
           <w14:ligatures w14:val="standardContextual"/>
         </w:rPr>
       </w:pPr>
-      <w:hyperlink w:anchor="_Toc242904065" w:history="1">
+      <w:hyperlink w:anchor="_Toc242906136" w:history="1">
+        <w:r>
+          <w:rPr>
+            <w:rStyle w:val="Hyperlink"/>
+            <w:noProof/>
+          </w:rPr>
+          <w:t>9. R</w:t>
+        </w:r>
+        <w:r>
+          <w:rPr>
+            <w:rStyle w:val="Hyperlink"/>
+            <w:noProof/>
+          </w:rPr>
+          <w:lastRenderedPageBreak/>
+          <w:t>esults and Discussion</w:t>
+        </w:r>
+        <w:r>
+          <w:rPr>
+            <w:noProof/>
+            <w:webHidden/>
+          </w:rPr>
+          <w:tab/>
+        </w:r>
+        <w:r>
+          <w:rPr>
+            <w:noProof/>
+            <w:webHidden/>
+          </w:rPr>
+          <w:fldChar w:fldCharType="begin"/>
+        </w:r>
+        <w:r>
+          <w:rPr>
+            <w:noProof/>
+            <w:webHidden/>
+          </w:rPr>
+          <w:instrText xml:space="preserve"> PAGEREF _Toc242906136 \h </w:instrText>
+        </w:r>
+        <w:r>
+          <w:rPr>
+            <w:noProof/>
+            <w:webHidden/>
+          </w:rPr>
+        </w:r>
+        <w:r>
+          <w:rPr>
+            <w:noProof/>
+            <w:webHidden/>
+          </w:rPr>
+          <w:fldChar w:fldCharType="separate"/>
+        </w:r>
+        <w:r>
+          <w:rPr>
+            <w:noProof/>
+            <w:webHidden/>
+          </w:rPr>
+          <w:t>14</w:t>
+        </w:r>
+        <w:r>
+          <w:rPr>
+            <w:noProof/>
+            <w:webHidden/>
+          </w:rPr>
+          <w:fldChar w:fldCharType="end"/>
+        </w:r>
+      </w:hyperlink>
+    </w:p>
+    <w:p>
+      <w:pPr>
+        <w:pStyle w:val="TOC2"/>
+        <w:rPr>
+          <w:rFonts w:asciiTheme="minorHAnsi" w:hAnsiTheme="minorHAnsi" w:cstheme="minorBidi"/>
+          <w:noProof/>
+          <w:color w:val="auto"/>
+          <w:kern w:val="2"/>
+          <w:sz w:val="24"/>
+          <w:szCs w:val="24"/>
+          <w14:ligatures w14:val="standardContextual"/>
+        </w:rPr>
+      </w:pPr>
+      <w:hyperlink w:anchor="_Toc242906137" w:history="1">
+        <w:r>
+          <w:rPr>
+            <w:rStyle w:val="Hyperlink"/>
+            <w:noProof/>
+          </w:rPr>
+          <w:t>9.1 Findings and Inferences</w:t>
+        </w:r>
+        <w:r>
+          <w:rPr>
+            <w:noProof/>
+            <w:webHidden/>
+          </w:rPr>
+          <w:tab/>
+        </w:r>
+        <w:r>
+          <w:rPr>
+            <w:noProof/>
+            <w:webHidden/>
+          </w:rPr>
+          <w:fldChar w:fldCharType="begin"/>
+        </w:r>
+        <w:r>
+          <w:rPr>
+            <w:noProof/>
+            <w:webHidden/>
+          </w:rPr>
+          <w:instrText xml:space="preserve"> PAGEREF _Toc242906137 \h </w:instrText>
+        </w:r>
+        <w:r>
+          <w:rPr>
+            <w:noProof/>
+            <w:webHidden/>
+          </w:rPr>
+        </w:r>
+        <w:r>
+          <w:rPr>
+            <w:noProof/>
+            <w:webHidden/>
+          </w:rPr>
+          <w:fldChar w:fldCharType="separate"/>
+        </w:r>
+        <w:r>
+          <w:rPr>
+            <w:noProof/>
+            <w:webHidden/>
+          </w:rPr>
+          <w:t>14</w:t>
+        </w:r>
+        <w:r>
+          <w:rPr>
+            <w:noProof/>
+            <w:webHidden/>
+          </w:rPr>
+          <w:fldChar w:fldCharType="end"/>
+        </w:r>
+      </w:hyperlink>
+    </w:p>
+    <w:p>
+      <w:pPr>
+        <w:pStyle w:val="TOC2"/>
+        <w:rPr>
+          <w:rFonts w:asciiTheme="minorHAnsi" w:hAnsiTheme="minorHAnsi" w:cstheme="minorBidi"/>
+          <w:noProof/>
+          <w:color w:val="auto"/>
+          <w:kern w:val="2"/>
+          <w:sz w:val="24"/>
+          <w:szCs w:val="24"/>
+          <w14:ligatures w14:val="standardContextual"/>
+        </w:rPr>
+      </w:pPr>
+      <w:hyperlink w:anchor="_Toc242906138" w:history="1">
+        <w:r>
+          <w:rPr>
+            <w:rStyle w:val="Hyperlink"/>
+            <w:noProof/>
+          </w:rPr>
+          <w:t>9.2 Innovation and Evidence</w:t>
+        </w:r>
+        <w:r>
+          <w:rPr>
+            <w:noProof/>
+            <w:webHidden/>
+          </w:rPr>
+          <w:tab/>
+        </w:r>
+        <w:r>
+          <w:rPr>
+            <w:noProof/>
+            <w:webHidden/>
+          </w:rPr>
+          <w:fldChar w:fldCharType="begin"/>
+        </w:r>
+        <w:r>
+          <w:rPr>
+            <w:noProof/>
+            <w:webHidden/>
+          </w:rPr>
+          <w:instrText xml:space="preserve"> PAGEREF _Toc242906138 \h </w:instrText>
+        </w:r>
+        <w:r>
+          <w:rPr>
+            <w:noProof/>
+            <w:webHidden/>
+          </w:rPr>
+        </w:r>
+        <w:r>
+          <w:rPr>
+            <w:noProof/>
+            <w:webHidden/>
+          </w:rPr>
+          <w:fldChar w:fldCharType="separate"/>
+        </w:r>
+        <w:r>
+          <w:rPr>
+            <w:noProof/>
+            <w:webHidden/>
+          </w:rPr>
+          <w:t>14</w:t>
+        </w:r>
+        <w:r>
+          <w:rPr>
+            <w:noProof/>
+            <w:webHidden/>
+          </w:rPr>
+          <w:fldChar w:fldCharType="end"/>
+        </w:r>
+      </w:hyperlink>
+    </w:p>
+    <w:p>
+      <w:pPr>
+        <w:pStyle w:val="TOC1"/>
+        <w:rPr>
+          <w:rFonts w:asciiTheme="minorHAnsi" w:hAnsiTheme="minorHAnsi" w:cstheme="minorBidi"/>
+          <w:noProof/>
+          <w:color w:val="auto"/>
+          <w:kern w:val="2"/>
+          <w:sz w:val="24"/>
+          <w:szCs w:val="24"/>
+          <w14:ligatures w14:val="standardContextual"/>
+        </w:rPr>
+      </w:pPr>
+      <w:hyperlink w:anchor="_Toc242906139" w:history="1">
         <w:r>
           <w:rPr>
             <w:rStyle w:val="Hyperlink"/>
@@ -1443,7 +1729,7 @@
             <w:noProof/>
             <w:webHidden/>
           </w:rPr>
-          <w:instrText xml:space="preserve"> PAGEREF _Toc242904065 \h </w:instrText>
+          <w:instrText xml:space="preserve"> PAGEREF _Toc242906139 \h </w:instrText>
         </w:r>
         <w:r>
           <w:rPr>
@@ -1463,7 +1749,7 @@
             <w:noProof/>
             <w:webHidden/>
           </w:rPr>
-          <w:t>11</w:t>
+          <w:t>14</w:t>
         </w:r>
         <w:r>
           <w:rPr>
@@ -1487,7 +1773,7 @@
           <w14:ligatures w14:val="standardContextual"/>
         </w:rPr>
       </w:pPr>
-      <w:hyperlink w:anchor="_Toc242904066" w:history="1">
+      <w:hyperlink w:anchor="_Toc242906140" w:history="1">
         <w:r>
           <w:rPr>
             <w:rStyle w:val="Hyperlink"/>
@@ -1514,7 +1800,7 @@
             <w:noProof/>
             <w:webHidden/>
           </w:rPr>
-          <w:instrText xml:space="preserve"> PAGEREF _Toc242904066 \h </w:instrText>
+          <w:instrText xml:space="preserve"> PAGEREF _Toc242906140 \h </w:instrText>
         </w:r>
         <w:r>
           <w:rPr>
@@ -1534,7 +1820,7 @@
             <w:noProof/>
             <w:webHidden/>
           </w:rPr>
-          <w:t>11</w:t>
+          <w:t>14</w:t>
         </w:r>
         <w:r>
           <w:rPr>
@@ -1551,10 +1837,9 @@
         <w:pageBreakBefore/>
       </w:pPr>
       <w:r>
-        <w:lastRenderedPageBreak/>
         <w:fldChar w:fldCharType="end"/>
       </w:r>
-      <w:bookmarkStart w:id="0" w:name="_Toc242904049"/>
+      <w:bookmarkStart w:id="0" w:name="_Toc242906119"/>
       <w:r>
         <w:t>1. Introduction</w:t>
       </w:r>
@@ -1578,13 +1863,34 @@
     </w:p>
     <w:p>
       <w:pPr>
+        <w:pStyle w:val="Heading2"/>
+      </w:pPr>
+      <w:bookmarkStart w:id="1" w:name="_Toc242906120"/>
+      <w:r>
+        <w:t>1.1 Practical Applications</w:t>
+      </w:r>
+      <w:bookmarkEnd w:id="1"/>
+    </w:p>
+    <w:p>
+      <w:pPr>
+        <w:jc w:val="both"/>
+      </w:pPr>
+      <w:r>
+        <w:t>FaultNet can support development testing of registration portals and checkout interfaces under delayed responses or HTTP errors, download clients under restricted bandwidth or interrupted transfers, and mobile interfaces under variable delay and delivery rates. JSON mocks allow a frontend to be exercised before its backend is available. In a networking laboratory, the workbench supports repeatable fault and recovery experiments with packet evidence. These are potential uses of the implemented controls; they</w:t>
+      </w:r>
+      <w:r>
+        <w:t xml:space="preserve"> are not claims of completed deployments. Developers must route the intended development requests through the live proxy and implement any fixes exposed by testing.</w:t>
+      </w:r>
+    </w:p>
+    <w:p>
+      <w:pPr>
         <w:pStyle w:val="Heading1"/>
       </w:pPr>
-      <w:bookmarkStart w:id="1" w:name="_Toc242904050"/>
+      <w:bookmarkStart w:id="2" w:name="_Toc242906121"/>
       <w:r>
         <w:t>2. Problem Statement</w:t>
       </w:r>
-      <w:bookmarkEnd w:id="1"/>
+      <w:bookmarkEnd w:id="2"/>
     </w:p>
     <w:p>
       <w:pPr>
@@ -1606,11 +1912,11 @@
       <w:pPr>
         <w:pStyle w:val="Heading1"/>
       </w:pPr>
-      <w:bookmarkStart w:id="2" w:name="_Toc242904051"/>
+      <w:bookmarkStart w:id="3" w:name="_Toc242906122"/>
       <w:r>
         <w:t>3. Objectives</w:t>
       </w:r>
-      <w:bookmarkEnd w:id="2"/>
+      <w:bookmarkEnd w:id="3"/>
     </w:p>
     <w:p>
       <w:pPr>
@@ -1665,12 +1971,12 @@
         <w:pStyle w:val="Heading1"/>
         <w:pageBreakBefore/>
       </w:pPr>
-      <w:bookmarkStart w:id="3" w:name="_Toc242904052"/>
+      <w:bookmarkStart w:id="4" w:name="_Toc242906123"/>
       <w:r>
         <w:lastRenderedPageBreak/>
         <w:t>4. Literature Review and Existing System</w:t>
       </w:r>
-      <w:bookmarkEnd w:id="3"/>
+      <w:bookmarkEnd w:id="4"/>
     </w:p>
     <w:p>
       <w:pPr>
@@ -2008,11 +2314,11 @@
         <w:pStyle w:val="Heading1"/>
         <w:spacing w:before="160"/>
       </w:pPr>
-      <w:bookmarkStart w:id="4" w:name="_Toc242904053"/>
+      <w:bookmarkStart w:id="5" w:name="_Toc242906124"/>
       <w:r>
         <w:t>5. Abstract</w:t>
       </w:r>
-      <w:bookmarkEnd w:id="4"/>
+      <w:bookmarkEnd w:id="5"/>
     </w:p>
     <w:p>
       <w:pPr>
@@ -2027,12 +2333,12 @@
         <w:pStyle w:val="Heading1"/>
         <w:pageBreakBefore/>
       </w:pPr>
-      <w:bookmarkStart w:id="5" w:name="_Toc242904054"/>
+      <w:bookmarkStart w:id="6" w:name="_Toc242906125"/>
       <w:r>
         <w:lastRenderedPageBreak/>
         <w:t>6. System Architecture and Workflow</w:t>
       </w:r>
-      <w:bookmarkEnd w:id="5"/>
+      <w:bookmarkEnd w:id="6"/>
     </w:p>
     <w:p>
       <w:pPr>
@@ -2836,15 +3142,1578 @@
     </w:p>
     <w:p>
       <w:pPr>
+        <w:pStyle w:val="Heading2"/>
+        <w:pageBreakBefore/>
+      </w:pPr>
+      <w:bookmarkStart w:id="7" w:name="_Toc242906126"/>
+      <w:r>
+        <w:lastRenderedPageBreak/>
+        <w:t>6.1 Dashboard Roles and Separation</w:t>
+      </w:r>
+      <w:bookmarkEnd w:id="7"/>
+    </w:p>
+    <w:p>
+      <w:pPr>
+        <w:jc w:val="both"/>
+      </w:pPr>
+      <w:r>
+        <w:t>The two dashboards address different testing questions. The experiment workbench asks how a controlled fault changes measurable request behavior and whether service is restored after clearance. The live proxy cockpit asks how individual development requests behave under an operator-selected combination of response and connection effects.</w:t>
+      </w:r>
+    </w:p>
+    <w:tbl>
+      <w:tblPr>
+        <w:tblW w:w="0" w:type="auto"/>
+        <w:jc w:val="center"/>
+        <w:tblBorders>
+          <w:top w:val="single" w:sz="5" w:space="0" w:color="D9D9D9"/>
+          <w:left w:val="single" w:sz="5" w:space="0" w:color="D9D9D9"/>
+          <w:bottom w:val="single" w:sz="5" w:space="0" w:color="D9D9D9"/>
+          <w:right w:val="single" w:sz="5" w:space="0" w:color="D9D9D9"/>
+          <w:insideH w:val="single" w:sz="5" w:space="0" w:color="D9D9D9"/>
+          <w:insideV w:val="single" w:sz="5" w:space="0" w:color="D9D9D9"/>
+        </w:tblBorders>
+        <w:tblLayout w:type="fixed"/>
+        <w:tblLook w:val="04A0" w:firstRow="1" w:lastRow="0" w:firstColumn="1" w:lastColumn="0" w:noHBand="0" w:noVBand="1"/>
+      </w:tblPr>
+      <w:tblGrid>
+        <w:gridCol w:w="1600"/>
+        <w:gridCol w:w="3700"/>
+        <w:gridCol w:w="3700"/>
+      </w:tblGrid>
+      <w:tr>
+        <w:trPr>
+          <w:cantSplit/>
+          <w:tblHeader/>
+          <w:jc w:val="center"/>
+        </w:trPr>
+        <w:tc>
+          <w:tcPr>
+            <w:tcW w:w="1600" w:type="dxa"/>
+            <w:shd w:val="clear" w:color="auto" w:fill="EAEAEA"/>
+            <w:tcMar>
+              <w:top w:w="85" w:type="dxa"/>
+              <w:left w:w="85" w:type="dxa"/>
+              <w:bottom w:w="85" w:type="dxa"/>
+              <w:right w:w="85" w:type="dxa"/>
+            </w:tcMar>
+            <w:vAlign w:val="center"/>
+          </w:tcPr>
+          <w:p>
+            <w:pPr>
+              <w:spacing w:after="40" w:line="252" w:lineRule="auto"/>
+            </w:pPr>
+            <w:r>
+              <w:rPr>
+                <w:b/>
+                <w:sz w:val="21"/>
+              </w:rPr>
+              <w:t>Aspect</w:t>
+            </w:r>
+          </w:p>
+        </w:tc>
+        <w:tc>
+          <w:tcPr>
+            <w:tcW w:w="3700" w:type="dxa"/>
+            <w:shd w:val="clear" w:color="auto" w:fill="EAEAEA"/>
+            <w:tcMar>
+              <w:top w:w="85" w:type="dxa"/>
+              <w:left w:w="85" w:type="dxa"/>
+              <w:bottom w:w="85" w:type="dxa"/>
+              <w:right w:w="85" w:type="dxa"/>
+            </w:tcMar>
+            <w:vAlign w:val="center"/>
+          </w:tcPr>
+          <w:p>
+            <w:pPr>
+              <w:spacing w:after="40" w:line="252" w:lineRule="auto"/>
+            </w:pPr>
+            <w:r>
+              <w:rPr>
+                <w:b/>
+                <w:sz w:val="21"/>
+              </w:rPr>
+              <w:t>Experiment workbench</w:t>
+            </w:r>
+          </w:p>
+        </w:tc>
+        <w:tc>
+          <w:tcPr>
+            <w:tcW w:w="3700" w:type="dxa"/>
+            <w:shd w:val="clear" w:color="auto" w:fill="EAEAEA"/>
+            <w:tcMar>
+              <w:top w:w="85" w:type="dxa"/>
+              <w:left w:w="85" w:type="dxa"/>
+              <w:bottom w:w="85" w:type="dxa"/>
+              <w:right w:w="85" w:type="dxa"/>
+            </w:tcMar>
+            <w:vAlign w:val="center"/>
+          </w:tcPr>
+          <w:p>
+            <w:pPr>
+              <w:spacing w:after="40" w:line="252" w:lineRule="auto"/>
+            </w:pPr>
+            <w:r>
+              <w:rPr>
+                <w:b/>
+                <w:sz w:val="21"/>
+              </w:rPr>
+              <w:t>Live proxy cockpit</w:t>
+            </w:r>
+          </w:p>
+        </w:tc>
+      </w:tr>
+      <w:tr>
+        <w:trPr>
+          <w:cantSplit/>
+          <w:jc w:val="center"/>
+        </w:trPr>
+        <w:tc>
+          <w:tcPr>
+            <w:tcW w:w="1600" w:type="dxa"/>
+            <w:tcMar>
+              <w:top w:w="85" w:type="dxa"/>
+              <w:left w:w="85" w:type="dxa"/>
+              <w:bottom w:w="85" w:type="dxa"/>
+              <w:right w:w="85" w:type="dxa"/>
+            </w:tcMar>
+            <w:vAlign w:val="center"/>
+          </w:tcPr>
+          <w:p>
+            <w:pPr>
+              <w:spacing w:after="40" w:line="252" w:lineRule="auto"/>
+            </w:pPr>
+            <w:r>
+              <w:rPr>
+                <w:sz w:val="21"/>
+              </w:rPr>
+              <w:t>Target</w:t>
+            </w:r>
+          </w:p>
+        </w:tc>
+        <w:tc>
+          <w:tcPr>
+            <w:tcW w:w="3700" w:type="dxa"/>
+            <w:tcMar>
+              <w:top w:w="85" w:type="dxa"/>
+              <w:left w:w="85" w:type="dxa"/>
+              <w:bottom w:w="85" w:type="dxa"/>
+              <w:right w:w="85" w:type="dxa"/>
+            </w:tcMar>
+            <w:vAlign w:val="center"/>
+          </w:tcPr>
+          <w:p>
+            <w:pPr>
+              <w:spacing w:after="40" w:line="252" w:lineRule="auto"/>
+            </w:pPr>
+            <w:r>
+              <w:rPr>
+                <w:sz w:val="21"/>
+              </w:rPr>
+              <w:t>Fixed 64 KiB demo workload</w:t>
+            </w:r>
+          </w:p>
+        </w:tc>
+        <w:tc>
+          <w:tcPr>
+            <w:tcW w:w="3700" w:type="dxa"/>
+            <w:tcMar>
+              <w:top w:w="85" w:type="dxa"/>
+              <w:left w:w="85" w:type="dxa"/>
+              <w:bottom w:w="85" w:type="dxa"/>
+              <w:right w:w="85" w:type="dxa"/>
+            </w:tcMar>
+            <w:vAlign w:val="center"/>
+          </w:tcPr>
+          <w:p>
+            <w:pPr>
+              <w:spacing w:after="40" w:line="252" w:lineRule="auto"/>
+            </w:pPr>
+            <w:r>
+              <w:rPr>
+                <w:sz w:val="21"/>
+              </w:rPr>
+              <w:t>Validated development HTTP/HTTPS origins; demo by default</w:t>
+            </w:r>
+          </w:p>
+        </w:tc>
+      </w:tr>
+      <w:tr>
+        <w:trPr>
+          <w:cantSplit/>
+          <w:jc w:val="center"/>
+        </w:trPr>
+        <w:tc>
+          <w:tcPr>
+            <w:tcW w:w="1600" w:type="dxa"/>
+            <w:tcMar>
+              <w:top w:w="85" w:type="dxa"/>
+              <w:left w:w="85" w:type="dxa"/>
+              <w:bottom w:w="85" w:type="dxa"/>
+              <w:right w:w="85" w:type="dxa"/>
+            </w:tcMar>
+            <w:vAlign w:val="center"/>
+          </w:tcPr>
+          <w:p>
+            <w:pPr>
+              <w:spacing w:after="40" w:line="252" w:lineRule="auto"/>
+            </w:pPr>
+            <w:r>
+              <w:rPr>
+                <w:sz w:val="21"/>
+              </w:rPr>
+              <w:t>Workflow</w:t>
+            </w:r>
+          </w:p>
+        </w:tc>
+        <w:tc>
+          <w:tcPr>
+            <w:tcW w:w="3700" w:type="dxa"/>
+            <w:tcMar>
+              <w:top w:w="85" w:type="dxa"/>
+              <w:left w:w="85" w:type="dxa"/>
+              <w:bottom w:w="85" w:type="dxa"/>
+              <w:right w:w="85" w:type="dxa"/>
+            </w:tcMar>
+            <w:vAlign w:val="center"/>
+          </w:tcPr>
+          <w:p>
+            <w:pPr>
+              <w:spacing w:after="40" w:line="252" w:lineRule="auto"/>
+            </w:pPr>
+            <w:r>
+              <w:rPr>
+                <w:sz w:val="21"/>
+              </w:rPr>
+              <w:t>Automatic baseline, faulty and recovery phases</w:t>
+            </w:r>
+          </w:p>
+        </w:tc>
+        <w:tc>
+          <w:tcPr>
+            <w:tcW w:w="3700" w:type="dxa"/>
+            <w:tcMar>
+              <w:top w:w="85" w:type="dxa"/>
+              <w:left w:w="85" w:type="dxa"/>
+              <w:bottom w:w="85" w:type="dxa"/>
+              <w:right w:w="85" w:type="dxa"/>
+            </w:tcMar>
+            <w:vAlign w:val="center"/>
+          </w:tcPr>
+          <w:p>
+            <w:pPr>
+              <w:spacing w:after="40" w:line="252" w:lineRule="auto"/>
+            </w:pPr>
+            <w:r>
+              <w:rPr>
+                <w:sz w:val="21"/>
+              </w:rPr>
+              <w:t>Manually apply settings, send traffic and reset</w:t>
+            </w:r>
+          </w:p>
+        </w:tc>
+      </w:tr>
+      <w:tr>
+        <w:trPr>
+          <w:cantSplit/>
+          <w:jc w:val="center"/>
+        </w:trPr>
+        <w:tc>
+          <w:tcPr>
+            <w:tcW w:w="1600" w:type="dxa"/>
+            <w:tcMar>
+              <w:top w:w="85" w:type="dxa"/>
+              <w:left w:w="85" w:type="dxa"/>
+              <w:bottom w:w="85" w:type="dxa"/>
+              <w:right w:w="85" w:type="dxa"/>
+            </w:tcMar>
+            <w:vAlign w:val="center"/>
+          </w:tcPr>
+          <w:p>
+            <w:pPr>
+              <w:spacing w:after="40" w:line="252" w:lineRule="auto"/>
+            </w:pPr>
+            <w:r>
+              <w:rPr>
+                <w:sz w:val="21"/>
+              </w:rPr>
+              <w:t>Fault scope</w:t>
+            </w:r>
+          </w:p>
+        </w:tc>
+        <w:tc>
+          <w:tcPr>
+            <w:tcW w:w="3700" w:type="dxa"/>
+            <w:tcMar>
+              <w:top w:w="85" w:type="dxa"/>
+              <w:left w:w="85" w:type="dxa"/>
+              <w:bottom w:w="85" w:type="dxa"/>
+              <w:right w:w="85" w:type="dxa"/>
+            </w:tcMar>
+            <w:vAlign w:val="center"/>
+          </w:tcPr>
+          <w:p>
+            <w:pPr>
+              <w:spacing w:after="40" w:line="252" w:lineRule="auto"/>
+            </w:pPr>
+            <w:r>
+              <w:rPr>
+                <w:sz w:val="21"/>
+              </w:rPr>
+              <w:t>One selected fault mechanism per run</w:t>
+            </w:r>
+          </w:p>
+        </w:tc>
+        <w:tc>
+          <w:tcPr>
+            <w:tcW w:w="3700" w:type="dxa"/>
+            <w:tcMar>
+              <w:top w:w="85" w:type="dxa"/>
+              <w:left w:w="85" w:type="dxa"/>
+              <w:bottom w:w="85" w:type="dxa"/>
+              <w:right w:w="85" w:type="dxa"/>
+            </w:tcMar>
+            <w:vAlign w:val="center"/>
+          </w:tcPr>
+          <w:p>
+            <w:pPr>
+              <w:spacing w:after="40" w:line="252" w:lineRule="auto"/>
+            </w:pPr>
+            <w:r>
+              <w:rPr>
+                <w:sz w:val="21"/>
+              </w:rPr>
+              <w:t>Network effects plus failure, status, header and mock controls</w:t>
+            </w:r>
+          </w:p>
+        </w:tc>
+      </w:tr>
+      <w:tr>
+        <w:trPr>
+          <w:cantSplit/>
+          <w:jc w:val="center"/>
+        </w:trPr>
+        <w:tc>
+          <w:tcPr>
+            <w:tcW w:w="1600" w:type="dxa"/>
+            <w:tcMar>
+              <w:top w:w="85" w:type="dxa"/>
+              <w:left w:w="85" w:type="dxa"/>
+              <w:bottom w:w="85" w:type="dxa"/>
+              <w:right w:w="85" w:type="dxa"/>
+            </w:tcMar>
+            <w:vAlign w:val="center"/>
+          </w:tcPr>
+          <w:p>
+            <w:pPr>
+              <w:spacing w:after="40" w:line="252" w:lineRule="auto"/>
+            </w:pPr>
+            <w:r>
+              <w:rPr>
+                <w:sz w:val="21"/>
+              </w:rPr>
+              <w:t>Evidence</w:t>
+            </w:r>
+          </w:p>
+        </w:tc>
+        <w:tc>
+          <w:tcPr>
+            <w:tcW w:w="3700" w:type="dxa"/>
+            <w:tcMar>
+              <w:top w:w="85" w:type="dxa"/>
+              <w:left w:w="85" w:type="dxa"/>
+              <w:bottom w:w="85" w:type="dxa"/>
+              <w:right w:w="85" w:type="dxa"/>
+            </w:tcMar>
+            <w:vAlign w:val="center"/>
+          </w:tcPr>
+          <w:p>
+            <w:pPr>
+              <w:spacing w:after="40" w:line="252" w:lineRule="auto"/>
+            </w:pPr>
+            <w:r>
+              <w:rPr>
+                <w:sz w:val="21"/>
+              </w:rPr>
+              <w:t>Phase statistics and individual probe observations</w:t>
+            </w:r>
+          </w:p>
+        </w:tc>
+        <w:tc>
+          <w:tcPr>
+            <w:tcW w:w="3700" w:type="dxa"/>
+            <w:tcMar>
+              <w:top w:w="85" w:type="dxa"/>
+              <w:left w:w="85" w:type="dxa"/>
+              <w:bottom w:w="85" w:type="dxa"/>
+              <w:right w:w="85" w:type="dxa"/>
+            </w:tcMar>
+            <w:vAlign w:val="center"/>
+          </w:tcPr>
+          <w:p>
+            <w:pPr>
+              <w:spacing w:after="40" w:line="252" w:lineRule="auto"/>
+            </w:pPr>
+            <w:r>
+              <w:rPr>
+                <w:sz w:val="21"/>
+              </w:rPr>
+              <w:t>Individual request status, duration, bytes and applied effects</w:t>
+            </w:r>
+          </w:p>
+        </w:tc>
+      </w:tr>
+      <w:tr>
+        <w:trPr>
+          <w:cantSplit/>
+          <w:jc w:val="center"/>
+        </w:trPr>
+        <w:tc>
+          <w:tcPr>
+            <w:tcW w:w="1600" w:type="dxa"/>
+            <w:tcMar>
+              <w:top w:w="85" w:type="dxa"/>
+              <w:left w:w="85" w:type="dxa"/>
+              <w:bottom w:w="85" w:type="dxa"/>
+              <w:right w:w="85" w:type="dxa"/>
+            </w:tcMar>
+            <w:vAlign w:val="center"/>
+          </w:tcPr>
+          <w:p>
+            <w:pPr>
+              <w:spacing w:after="40" w:line="252" w:lineRule="auto"/>
+            </w:pPr>
+            <w:r>
+              <w:rPr>
+                <w:sz w:val="21"/>
+              </w:rPr>
+              <w:t>Persistence</w:t>
+            </w:r>
+          </w:p>
+        </w:tc>
+        <w:tc>
+          <w:tcPr>
+            <w:tcW w:w="3700" w:type="dxa"/>
+            <w:tcMar>
+              <w:top w:w="85" w:type="dxa"/>
+              <w:left w:w="85" w:type="dxa"/>
+              <w:bottom w:w="85" w:type="dxa"/>
+              <w:right w:w="85" w:type="dxa"/>
+            </w:tcMar>
+            <w:vAlign w:val="center"/>
+          </w:tcPr>
+          <w:p>
+            <w:pPr>
+              <w:spacing w:after="40" w:line="252" w:lineRule="auto"/>
+            </w:pPr>
+            <w:r>
+              <w:rPr>
+                <w:sz w:val="21"/>
+              </w:rPr>
+              <w:t>Local JSON records with JSON/CSV exports</w:t>
+            </w:r>
+          </w:p>
+        </w:tc>
+        <w:tc>
+          <w:tcPr>
+            <w:tcW w:w="3700" w:type="dxa"/>
+            <w:tcMar>
+              <w:top w:w="85" w:type="dxa"/>
+              <w:left w:w="85" w:type="dxa"/>
+              <w:bottom w:w="85" w:type="dxa"/>
+              <w:right w:w="85" w:type="dxa"/>
+            </w:tcMar>
+            <w:vAlign w:val="center"/>
+          </w:tcPr>
+          <w:p>
+            <w:pPr>
+              <w:spacing w:after="40" w:line="252" w:lineRule="auto"/>
+            </w:pPr>
+            <w:r>
+              <w:rPr>
+                <w:sz w:val="21"/>
+              </w:rPr>
+              <w:t>Latest 50 finished requests in process memory</w:t>
+            </w:r>
+          </w:p>
+        </w:tc>
+      </w:tr>
+      <w:tr>
+        <w:trPr>
+          <w:cantSplit/>
+          <w:jc w:val="center"/>
+        </w:trPr>
+        <w:tc>
+          <w:tcPr>
+            <w:tcW w:w="1600" w:type="dxa"/>
+            <w:tcMar>
+              <w:top w:w="85" w:type="dxa"/>
+              <w:left w:w="85" w:type="dxa"/>
+              <w:bottom w:w="85" w:type="dxa"/>
+              <w:right w:w="85" w:type="dxa"/>
+            </w:tcMar>
+            <w:vAlign w:val="center"/>
+          </w:tcPr>
+          <w:p>
+            <w:pPr>
+              <w:spacing w:after="40" w:line="252" w:lineRule="auto"/>
+            </w:pPr>
+            <w:r>
+              <w:rPr>
+                <w:sz w:val="21"/>
+              </w:rPr>
+              <w:t>Traffic port</w:t>
+            </w:r>
+          </w:p>
+        </w:tc>
+        <w:tc>
+          <w:tcPr>
+            <w:tcW w:w="3700" w:type="dxa"/>
+            <w:tcMar>
+              <w:top w:w="85" w:type="dxa"/>
+              <w:left w:w="85" w:type="dxa"/>
+              <w:bottom w:w="85" w:type="dxa"/>
+              <w:right w:w="85" w:type="dxa"/>
+            </w:tcMar>
+            <w:vAlign w:val="center"/>
+          </w:tcPr>
+          <w:p>
+            <w:pPr>
+              <w:spacing w:after="40" w:line="252" w:lineRule="auto"/>
+            </w:pPr>
+            <w:r>
+              <w:rPr>
+                <w:sz w:val="21"/>
+              </w:rPr>
+              <w:t>3002</w:t>
+            </w:r>
+          </w:p>
+        </w:tc>
+        <w:tc>
+          <w:tcPr>
+            <w:tcW w:w="3700" w:type="dxa"/>
+            <w:tcMar>
+              <w:top w:w="85" w:type="dxa"/>
+              <w:left w:w="85" w:type="dxa"/>
+              <w:bottom w:w="85" w:type="dxa"/>
+              <w:right w:w="85" w:type="dxa"/>
+            </w:tcMar>
+            <w:vAlign w:val="center"/>
+          </w:tcPr>
+          <w:p>
+            <w:pPr>
+              <w:spacing w:after="40" w:line="252" w:lineRule="auto"/>
+            </w:pPr>
+            <w:r>
+              <w:rPr>
+                <w:sz w:val="21"/>
+              </w:rPr>
+              <w:t>8080</w:t>
+            </w:r>
+          </w:p>
+        </w:tc>
+      </w:tr>
+    </w:tbl>
+    <w:p>
+      <w:pPr>
+        <w:keepNext/>
+        <w:spacing w:after="0" w:line="240" w:lineRule="auto"/>
+      </w:pPr>
+    </w:p>
+    <w:p>
+      <w:pPr>
+        <w:jc w:val="both"/>
+      </w:pPr>
+      <w:r>
+        <w:t>Separate interfaces keep repeatable measurements distinct from exploratory testing. A fixed workload and controlled phases support fair within-run comparisons. The cockpit gives developers broader manual controls for inspecting application handling of slow responses, HTTP errors and incomplete bodies. The experiment proxy and live proxy have independent settings: changes in one dashboard do not change the other's faults.</w:t>
+      </w:r>
+    </w:p>
+    <w:p>
+      <w:pPr>
+        <w:jc w:val="both"/>
+      </w:pPr>
+      <w:r>
+        <w:t>Wireshark independently observes the real HTTP traffic. Packet Tracer separately models link failure and routing recovery; its virtual topology does not configure either dashboard. FaultNet is a testing tool that exposes behavior, rather than an automatic repair mechanism.</w:t>
+      </w:r>
+    </w:p>
+    <w:p>
+      <w:pPr>
+        <w:pStyle w:val="Heading2"/>
+        <w:pageBreakBefore/>
+      </w:pPr>
+      <w:bookmarkStart w:id="8" w:name="_Toc242906127"/>
+      <w:r>
+        <w:lastRenderedPageBreak/>
+        <w:t>6.2 Experiment Workbench Functions</w:t>
+      </w:r>
+      <w:bookmarkEnd w:id="8"/>
+    </w:p>
+    <w:p>
+      <w:pPr>
+        <w:jc w:val="both"/>
+      </w:pPr>
+      <w:r>
+        <w:t>The workbench supports baseline-only testing or an automatic baseline-to-fault-to-recovery run. Users choose the fault, probe count, interval and request timeout. The server validates the settings and enforces a conservative 120-second probing budget. Baseline and recovery requests use normal forwarding. Recovery requires three consecutive successful requests within a 15-second window after fault clearance.</w:t>
+      </w:r>
+    </w:p>
+    <w:tbl>
+      <w:tblPr>
+        <w:tblW w:w="0" w:type="auto"/>
+        <w:jc w:val="center"/>
+        <w:tblBorders>
+          <w:top w:val="single" w:sz="5" w:space="0" w:color="D9D9D9"/>
+          <w:left w:val="single" w:sz="5" w:space="0" w:color="D9D9D9"/>
+          <w:bottom w:val="single" w:sz="5" w:space="0" w:color="D9D9D9"/>
+          <w:right w:val="single" w:sz="5" w:space="0" w:color="D9D9D9"/>
+          <w:insideH w:val="single" w:sz="5" w:space="0" w:color="D9D9D9"/>
+          <w:insideV w:val="single" w:sz="5" w:space="0" w:color="D9D9D9"/>
+        </w:tblBorders>
+        <w:tblLayout w:type="fixed"/>
+        <w:tblLook w:val="04A0" w:firstRow="1" w:lastRow="0" w:firstColumn="1" w:lastColumn="0" w:noHBand="0" w:noVBand="1"/>
+      </w:tblPr>
+      <w:tblGrid>
+        <w:gridCol w:w="1900"/>
+        <w:gridCol w:w="3800"/>
+        <w:gridCol w:w="3300"/>
+      </w:tblGrid>
+      <w:tr>
+        <w:trPr>
+          <w:cantSplit/>
+          <w:tblHeader/>
+          <w:jc w:val="center"/>
+        </w:trPr>
+        <w:tc>
+          <w:tcPr>
+            <w:tcW w:w="1900" w:type="dxa"/>
+            <w:shd w:val="clear" w:color="auto" w:fill="EAEAEA"/>
+            <w:tcMar>
+              <w:top w:w="85" w:type="dxa"/>
+              <w:left w:w="85" w:type="dxa"/>
+              <w:bottom w:w="85" w:type="dxa"/>
+              <w:right w:w="85" w:type="dxa"/>
+            </w:tcMar>
+            <w:vAlign w:val="center"/>
+          </w:tcPr>
+          <w:p>
+            <w:pPr>
+              <w:spacing w:after="40" w:line="252" w:lineRule="auto"/>
+            </w:pPr>
+            <w:r>
+              <w:rPr>
+                <w:b/>
+                <w:sz w:val="21"/>
+              </w:rPr>
+              <w:t>Fault mechanism</w:t>
+            </w:r>
+          </w:p>
+        </w:tc>
+        <w:tc>
+          <w:tcPr>
+            <w:tcW w:w="3800" w:type="dxa"/>
+            <w:shd w:val="clear" w:color="auto" w:fill="EAEAEA"/>
+            <w:tcMar>
+              <w:top w:w="85" w:type="dxa"/>
+              <w:left w:w="85" w:type="dxa"/>
+              <w:bottom w:w="85" w:type="dxa"/>
+              <w:right w:w="85" w:type="dxa"/>
+            </w:tcMar>
+            <w:vAlign w:val="center"/>
+          </w:tcPr>
+          <w:p>
+            <w:pPr>
+              <w:spacing w:after="40" w:line="252" w:lineRule="auto"/>
+            </w:pPr>
+            <w:r>
+              <w:rPr>
+                <w:b/>
+                <w:sz w:val="21"/>
+              </w:rPr>
+              <w:t>Actual action</w:t>
+            </w:r>
+          </w:p>
+        </w:tc>
+        <w:tc>
+          <w:tcPr>
+            <w:tcW w:w="3300" w:type="dxa"/>
+            <w:shd w:val="clear" w:color="auto" w:fill="EAEAEA"/>
+            <w:tcMar>
+              <w:top w:w="85" w:type="dxa"/>
+              <w:left w:w="85" w:type="dxa"/>
+              <w:bottom w:w="85" w:type="dxa"/>
+              <w:right w:w="85" w:type="dxa"/>
+            </w:tcMar>
+            <w:vAlign w:val="center"/>
+          </w:tcPr>
+          <w:p>
+            <w:pPr>
+              <w:spacing w:after="40" w:line="252" w:lineRule="auto"/>
+            </w:pPr>
+            <w:r>
+              <w:rPr>
+                <w:b/>
+                <w:sz w:val="21"/>
+              </w:rPr>
+              <w:t>Issue examined</w:t>
+            </w:r>
+          </w:p>
+        </w:tc>
+      </w:tr>
+      <w:tr>
+        <w:trPr>
+          <w:cantSplit/>
+          <w:jc w:val="center"/>
+        </w:trPr>
+        <w:tc>
+          <w:tcPr>
+            <w:tcW w:w="1900" w:type="dxa"/>
+            <w:tcMar>
+              <w:top w:w="85" w:type="dxa"/>
+              <w:left w:w="85" w:type="dxa"/>
+              <w:bottom w:w="85" w:type="dxa"/>
+              <w:right w:w="85" w:type="dxa"/>
+            </w:tcMar>
+            <w:vAlign w:val="center"/>
+          </w:tcPr>
+          <w:p>
+            <w:pPr>
+              <w:spacing w:after="40" w:line="252" w:lineRule="auto"/>
+            </w:pPr>
+            <w:r>
+              <w:rPr>
+                <w:sz w:val="21"/>
+              </w:rPr>
+              <w:t>Response delay</w:t>
+            </w:r>
+          </w:p>
+        </w:tc>
+        <w:tc>
+          <w:tcPr>
+            <w:tcW w:w="3800" w:type="dxa"/>
+            <w:tcMar>
+              <w:top w:w="85" w:type="dxa"/>
+              <w:left w:w="85" w:type="dxa"/>
+              <w:bottom w:w="85" w:type="dxa"/>
+              <w:right w:w="85" w:type="dxa"/>
+            </w:tcMar>
+            <w:vAlign w:val="center"/>
+          </w:tcPr>
+          <w:p>
+            <w:pPr>
+              <w:spacing w:after="40" w:line="252" w:lineRule="auto"/>
+            </w:pPr>
+            <w:r>
+              <w:rPr>
+                <w:sz w:val="21"/>
+              </w:rPr>
+              <w:t>Wait before forwarding a faulty request</w:t>
+            </w:r>
+          </w:p>
+        </w:tc>
+        <w:tc>
+          <w:tcPr>
+            <w:tcW w:w="3300" w:type="dxa"/>
+            <w:tcMar>
+              <w:top w:w="85" w:type="dxa"/>
+              <w:left w:w="85" w:type="dxa"/>
+              <w:bottom w:w="85" w:type="dxa"/>
+              <w:right w:w="85" w:type="dxa"/>
+            </w:tcMar>
+            <w:vAlign w:val="center"/>
+          </w:tcPr>
+          <w:p>
+            <w:pPr>
+              <w:spacing w:after="40" w:line="252" w:lineRule="auto"/>
+            </w:pPr>
+            <w:r>
+              <w:rPr>
+                <w:sz w:val="21"/>
+              </w:rPr>
+              <w:t>Slow responses and client timeout sensitivity</w:t>
+            </w:r>
+          </w:p>
+        </w:tc>
+      </w:tr>
+      <w:tr>
+        <w:trPr>
+          <w:cantSplit/>
+          <w:jc w:val="center"/>
+        </w:trPr>
+        <w:tc>
+          <w:tcPr>
+            <w:tcW w:w="1900" w:type="dxa"/>
+            <w:tcMar>
+              <w:top w:w="85" w:type="dxa"/>
+              <w:left w:w="85" w:type="dxa"/>
+              <w:bottom w:w="85" w:type="dxa"/>
+              <w:right w:w="85" w:type="dxa"/>
+            </w:tcMar>
+            <w:vAlign w:val="center"/>
+          </w:tcPr>
+          <w:p>
+            <w:pPr>
+              <w:spacing w:after="40" w:line="252" w:lineRule="auto"/>
+            </w:pPr>
+            <w:r>
+              <w:rPr>
+                <w:sz w:val="21"/>
+              </w:rPr>
+              <w:t>Bandwidth restriction</w:t>
+            </w:r>
+          </w:p>
+        </w:tc>
+        <w:tc>
+          <w:tcPr>
+            <w:tcW w:w="3800" w:type="dxa"/>
+            <w:tcMar>
+              <w:top w:w="85" w:type="dxa"/>
+              <w:left w:w="85" w:type="dxa"/>
+              <w:bottom w:w="85" w:type="dxa"/>
+              <w:right w:w="85" w:type="dxa"/>
+            </w:tcMar>
+            <w:vAlign w:val="center"/>
+          </w:tcPr>
+          <w:p>
+            <w:pPr>
+              <w:spacing w:after="40" w:line="252" w:lineRule="auto"/>
+            </w:pPr>
+            <w:r>
+              <w:rPr>
+                <w:sz w:val="21"/>
+              </w:rPr>
+              <w:t>Pace response-body chunks at the selected KiB/s rate</w:t>
+            </w:r>
+          </w:p>
+        </w:tc>
+        <w:tc>
+          <w:tcPr>
+            <w:tcW w:w="3300" w:type="dxa"/>
+            <w:tcMar>
+              <w:top w:w="85" w:type="dxa"/>
+              <w:left w:w="85" w:type="dxa"/>
+              <w:bottom w:w="85" w:type="dxa"/>
+              <w:right w:w="85" w:type="dxa"/>
+            </w:tcMar>
+            <w:vAlign w:val="center"/>
+          </w:tcPr>
+          <w:p>
+            <w:pPr>
+              <w:spacing w:after="40" w:line="252" w:lineRule="auto"/>
+            </w:pPr>
+            <w:r>
+              <w:rPr>
+                <w:sz w:val="21"/>
+              </w:rPr>
+              <w:t>Longer transfers and reduced payload goodput</w:t>
+            </w:r>
+          </w:p>
+        </w:tc>
+      </w:tr>
+      <w:tr>
+        <w:trPr>
+          <w:cantSplit/>
+          <w:jc w:val="center"/>
+        </w:trPr>
+        <w:tc>
+          <w:tcPr>
+            <w:tcW w:w="1900" w:type="dxa"/>
+            <w:tcMar>
+              <w:top w:w="85" w:type="dxa"/>
+              <w:left w:w="85" w:type="dxa"/>
+              <w:bottom w:w="85" w:type="dxa"/>
+              <w:right w:w="85" w:type="dxa"/>
+            </w:tcMar>
+            <w:vAlign w:val="center"/>
+          </w:tcPr>
+          <w:p>
+            <w:pPr>
+              <w:spacing w:after="40" w:line="252" w:lineRule="auto"/>
+            </w:pPr>
+            <w:r>
+              <w:rPr>
+                <w:sz w:val="21"/>
+              </w:rPr>
+              <w:t>Connection interruption</w:t>
+            </w:r>
+          </w:p>
+        </w:tc>
+        <w:tc>
+          <w:tcPr>
+            <w:tcW w:w="3800" w:type="dxa"/>
+            <w:tcMar>
+              <w:top w:w="85" w:type="dxa"/>
+              <w:left w:w="85" w:type="dxa"/>
+              <w:bottom w:w="85" w:type="dxa"/>
+              <w:right w:w="85" w:type="dxa"/>
+            </w:tcMar>
+            <w:vAlign w:val="center"/>
+          </w:tcPr>
+          <w:p>
+            <w:pPr>
+              <w:spacing w:after="40" w:line="252" w:lineRule="auto"/>
+            </w:pPr>
+            <w:r>
+              <w:rPr>
+                <w:sz w:val="21"/>
+              </w:rPr>
+              <w:t>Close the faulty client connection before forwarding</w:t>
+            </w:r>
+          </w:p>
+        </w:tc>
+        <w:tc>
+          <w:tcPr>
+            <w:tcW w:w="3300" w:type="dxa"/>
+            <w:tcMar>
+              <w:top w:w="85" w:type="dxa"/>
+              <w:left w:w="85" w:type="dxa"/>
+              <w:bottom w:w="85" w:type="dxa"/>
+              <w:right w:w="85" w:type="dxa"/>
+            </w:tcMar>
+            <w:vAlign w:val="center"/>
+          </w:tcPr>
+          <w:p>
+            <w:pPr>
+              <w:spacing w:after="40" w:line="252" w:lineRule="auto"/>
+            </w:pPr>
+            <w:r>
+              <w:rPr>
+                <w:sz w:val="21"/>
+              </w:rPr>
+              <w:t>Incomplete HTTP exchanges and subsequent restoration</w:t>
+            </w:r>
+          </w:p>
+        </w:tc>
+      </w:tr>
+    </w:tbl>
+    <w:p>
+      <w:pPr>
+        <w:keepNext/>
+        <w:spacing w:after="0" w:line="240" w:lineRule="auto"/>
+      </w:pPr>
+    </w:p>
+    <w:p>
+      <w:pPr>
+        <w:jc w:val="both"/>
+      </w:pPr>
+      <w:r>
+        <w:t>Six editable presets cover healthy connections, mild delay, severe delay, constrained bandwidth, timeout stress and complete HTTP outage. They fill in settings without starting traffic. Timeout stress is a delay that exceeds the client timeout, not a separate fault mechanism. Reuse selected run settings copies a saved configuration into a new draft without changing its evidence.</w:t>
+      </w:r>
+    </w:p>
+    <w:p>
+      <w:pPr>
+        <w:jc w:val="both"/>
+      </w:pPr>
+      <w:r>
+        <w:t>Start experiment launches the run; Stop cancels active work and initiates fault clearance. Refresh updates service and record information. Auto, baseline, faulty and recovery selections determine the statistics under inspection. Availability, mean, median, p95, minimum, maximum, goodput and baseline changes are accompanied by phase counts and exact probe measurements. Charts show phase medians, attempt durations, successful-response distributions and outcome counts. Missing successful samples remain unavail</w:t>
+      </w:r>
+      <w:r>
+        <w:t>able rather than becoming zero.</w:t>
+      </w:r>
+    </w:p>
+    <w:p>
+      <w:pPr>
+        <w:jc w:val="both"/>
+      </w:pPr>
+      <w:r>
+        <w:t>Saved experiments reopen persistent records, while JSON and CSV downloads preserve settings and observations for review. Compare experiments accepts matching measurement protocols, including count, interval, timeout, workload and recovery rules, while permitting different faults. Runs with different timeouts require an intentional manual comparison of their tables or exports.</w:t>
+      </w:r>
+    </w:p>
+    <w:p>
+      <w:pPr>
+        <w:pStyle w:val="Heading2"/>
+        <w:pageBreakBefore/>
+      </w:pPr>
+      <w:bookmarkStart w:id="9" w:name="_Toc242906128"/>
+      <w:r>
+        <w:lastRenderedPageBreak/>
+        <w:t>6.3 Live Proxy Cockpit Functions</w:t>
+      </w:r>
+      <w:bookmarkEnd w:id="9"/>
+    </w:p>
+    <w:p>
+      <w:pPr>
+        <w:jc w:val="both"/>
+      </w:pPr>
+      <w:r>
+        <w:t>The cockpit forwards development traffic through port 8080. Unified routing selects one application origin; split routing selects frontend or backend origins using configured backend path prefixes. Requests must pass through that entry to receive the applied effects. The default demo exposes /payload. Presets and sliders edit a draft, Apply changes activates it for subsequent requests, and Reload applied retrieves the current configuration.</w:t>
+      </w:r>
+    </w:p>
+    <w:tbl>
+      <w:tblPr>
+        <w:tblW w:w="0" w:type="auto"/>
+        <w:jc w:val="center"/>
+        <w:tblBorders>
+          <w:top w:val="single" w:sz="5" w:space="0" w:color="D9D9D9"/>
+          <w:left w:val="single" w:sz="5" w:space="0" w:color="D9D9D9"/>
+          <w:bottom w:val="single" w:sz="5" w:space="0" w:color="D9D9D9"/>
+          <w:right w:val="single" w:sz="5" w:space="0" w:color="D9D9D9"/>
+          <w:insideH w:val="single" w:sz="5" w:space="0" w:color="D9D9D9"/>
+          <w:insideV w:val="single" w:sz="5" w:space="0" w:color="D9D9D9"/>
+        </w:tblBorders>
+        <w:tblLayout w:type="fixed"/>
+        <w:tblLook w:val="04A0" w:firstRow="1" w:lastRow="0" w:firstColumn="1" w:lastColumn="0" w:noHBand="0" w:noVBand="1"/>
+      </w:tblPr>
+      <w:tblGrid>
+        <w:gridCol w:w="2700"/>
+        <w:gridCol w:w="6300"/>
+      </w:tblGrid>
+      <w:tr>
+        <w:trPr>
+          <w:cantSplit/>
+          <w:tblHeader/>
+          <w:jc w:val="center"/>
+        </w:trPr>
+        <w:tc>
+          <w:tcPr>
+            <w:tcW w:w="2700" w:type="dxa"/>
+            <w:shd w:val="clear" w:color="auto" w:fill="EAEAEA"/>
+            <w:tcMar>
+              <w:top w:w="85" w:type="dxa"/>
+              <w:left w:w="85" w:type="dxa"/>
+              <w:bottom w:w="85" w:type="dxa"/>
+              <w:right w:w="85" w:type="dxa"/>
+            </w:tcMar>
+            <w:vAlign w:val="center"/>
+          </w:tcPr>
+          <w:p>
+            <w:pPr>
+              <w:spacing w:after="40" w:line="252" w:lineRule="auto"/>
+            </w:pPr>
+            <w:r>
+              <w:rPr>
+                <w:b/>
+                <w:sz w:val="21"/>
+              </w:rPr>
+              <w:t>Control</w:t>
+            </w:r>
+          </w:p>
+        </w:tc>
+        <w:tc>
+          <w:tcPr>
+            <w:tcW w:w="6300" w:type="dxa"/>
+            <w:shd w:val="clear" w:color="auto" w:fill="EAEAEA"/>
+            <w:tcMar>
+              <w:top w:w="85" w:type="dxa"/>
+              <w:left w:w="85" w:type="dxa"/>
+              <w:bottom w:w="85" w:type="dxa"/>
+              <w:right w:w="85" w:type="dxa"/>
+            </w:tcMar>
+            <w:vAlign w:val="center"/>
+          </w:tcPr>
+          <w:p>
+            <w:pPr>
+              <w:spacing w:after="40" w:line="252" w:lineRule="auto"/>
+            </w:pPr>
+            <w:r>
+              <w:rPr>
+                <w:b/>
+                <w:sz w:val="21"/>
+              </w:rPr>
+              <w:t>Effect and testing purpose</w:t>
+            </w:r>
+          </w:p>
+        </w:tc>
+      </w:tr>
+      <w:tr>
+        <w:trPr>
+          <w:cantSplit/>
+          <w:jc w:val="center"/>
+        </w:trPr>
+        <w:tc>
+          <w:tcPr>
+            <w:tcW w:w="2700" w:type="dxa"/>
+            <w:tcMar>
+              <w:top w:w="85" w:type="dxa"/>
+              <w:left w:w="85" w:type="dxa"/>
+              <w:bottom w:w="85" w:type="dxa"/>
+              <w:right w:w="85" w:type="dxa"/>
+            </w:tcMar>
+            <w:vAlign w:val="center"/>
+          </w:tcPr>
+          <w:p>
+            <w:pPr>
+              <w:spacing w:after="40" w:line="252" w:lineRule="auto"/>
+            </w:pPr>
+            <w:r>
+              <w:rPr>
+                <w:sz w:val="21"/>
+              </w:rPr>
+              <w:t>Request and response delay</w:t>
+            </w:r>
+          </w:p>
+        </w:tc>
+        <w:tc>
+          <w:tcPr>
+            <w:tcW w:w="6300" w:type="dxa"/>
+            <w:tcMar>
+              <w:top w:w="85" w:type="dxa"/>
+              <w:left w:w="85" w:type="dxa"/>
+              <w:bottom w:w="85" w:type="dxa"/>
+              <w:right w:w="85" w:type="dxa"/>
+            </w:tcMar>
+            <w:vAlign w:val="center"/>
+          </w:tcPr>
+          <w:p>
+            <w:pPr>
+              <w:spacing w:after="40" w:line="252" w:lineRule="auto"/>
+            </w:pPr>
+            <w:r>
+              <w:rPr>
+                <w:sz w:val="21"/>
+              </w:rPr>
+              <w:t>Wait before upstream forwarding or before response delivery; test slow exchanges.</w:t>
+            </w:r>
+          </w:p>
+        </w:tc>
+      </w:tr>
+      <w:tr>
+        <w:trPr>
+          <w:cantSplit/>
+          <w:jc w:val="center"/>
+        </w:trPr>
+        <w:tc>
+          <w:tcPr>
+            <w:tcW w:w="2700" w:type="dxa"/>
+            <w:tcMar>
+              <w:top w:w="85" w:type="dxa"/>
+              <w:left w:w="85" w:type="dxa"/>
+              <w:bottom w:w="85" w:type="dxa"/>
+              <w:right w:w="85" w:type="dxa"/>
+            </w:tcMar>
+            <w:vAlign w:val="center"/>
+          </w:tcPr>
+          <w:p>
+            <w:pPr>
+              <w:spacing w:after="40" w:line="252" w:lineRule="auto"/>
+            </w:pPr>
+            <w:r>
+              <w:rPr>
+                <w:sz w:val="21"/>
+              </w:rPr>
+              <w:t>Jitter</w:t>
+            </w:r>
+          </w:p>
+        </w:tc>
+        <w:tc>
+          <w:tcPr>
+            <w:tcW w:w="6300" w:type="dxa"/>
+            <w:tcMar>
+              <w:top w:w="85" w:type="dxa"/>
+              <w:left w:w="85" w:type="dxa"/>
+              <w:bottom w:w="85" w:type="dxa"/>
+              <w:right w:w="85" w:type="dxa"/>
+            </w:tcMar>
+            <w:vAlign w:val="center"/>
+          </w:tcPr>
+          <w:p>
+            <w:pPr>
+              <w:spacing w:after="40" w:line="252" w:lineRule="auto"/>
+            </w:pPr>
+            <w:r>
+              <w:rPr>
+                <w:sz w:val="21"/>
+              </w:rPr>
+              <w:t>Vary each direction's delay around its configured value, clamped at zero; test timing variability.</w:t>
+            </w:r>
+          </w:p>
+        </w:tc>
+      </w:tr>
+      <w:tr>
+        <w:trPr>
+          <w:cantSplit/>
+          <w:jc w:val="center"/>
+        </w:trPr>
+        <w:tc>
+          <w:tcPr>
+            <w:tcW w:w="2700" w:type="dxa"/>
+            <w:tcMar>
+              <w:top w:w="85" w:type="dxa"/>
+              <w:left w:w="85" w:type="dxa"/>
+              <w:bottom w:w="85" w:type="dxa"/>
+              <w:right w:w="85" w:type="dxa"/>
+            </w:tcMar>
+            <w:vAlign w:val="center"/>
+          </w:tcPr>
+          <w:p>
+            <w:pPr>
+              <w:spacing w:after="40" w:line="252" w:lineRule="auto"/>
+            </w:pPr>
+            <w:r>
+              <w:rPr>
+                <w:sz w:val="21"/>
+              </w:rPr>
+              <w:t>Upload and download limits</w:t>
+            </w:r>
+          </w:p>
+        </w:tc>
+        <w:tc>
+          <w:tcPr>
+            <w:tcW w:w="6300" w:type="dxa"/>
+            <w:tcMar>
+              <w:top w:w="85" w:type="dxa"/>
+              <w:left w:w="85" w:type="dxa"/>
+              <w:bottom w:w="85" w:type="dxa"/>
+              <w:right w:w="85" w:type="dxa"/>
+            </w:tcMar>
+            <w:vAlign w:val="center"/>
+          </w:tcPr>
+          <w:p>
+            <w:pPr>
+              <w:spacing w:after="40" w:line="252" w:lineRule="auto"/>
+            </w:pPr>
+            <w:r>
+              <w:rPr>
+                <w:sz w:val="21"/>
+              </w:rPr>
+              <w:t>Pace request and response bodies in KiB/s; zero means unlimited.</w:t>
+            </w:r>
+          </w:p>
+        </w:tc>
+      </w:tr>
+      <w:tr>
+        <w:trPr>
+          <w:cantSplit/>
+          <w:jc w:val="center"/>
+        </w:trPr>
+        <w:tc>
+          <w:tcPr>
+            <w:tcW w:w="2700" w:type="dxa"/>
+            <w:tcMar>
+              <w:top w:w="85" w:type="dxa"/>
+              <w:left w:w="85" w:type="dxa"/>
+              <w:bottom w:w="85" w:type="dxa"/>
+              <w:right w:w="85" w:type="dxa"/>
+            </w:tcMar>
+            <w:vAlign w:val="center"/>
+          </w:tcPr>
+          <w:p>
+            <w:pPr>
+              <w:spacing w:after="40" w:line="252" w:lineRule="auto"/>
+            </w:pPr>
+            <w:r>
+              <w:rPr>
+                <w:sz w:val="21"/>
+              </w:rPr>
+              <w:t>Timeout mode</w:t>
+            </w:r>
+          </w:p>
+        </w:tc>
+        <w:tc>
+          <w:tcPr>
+            <w:tcW w:w="6300" w:type="dxa"/>
+            <w:tcMar>
+              <w:top w:w="85" w:type="dxa"/>
+              <w:left w:w="85" w:type="dxa"/>
+              <w:bottom w:w="85" w:type="dxa"/>
+              <w:right w:w="85" w:type="dxa"/>
+            </w:tcMar>
+            <w:vAlign w:val="center"/>
+          </w:tcPr>
+          <w:p>
+            <w:pPr>
+              <w:spacing w:after="40" w:line="252" w:lineRule="auto"/>
+            </w:pPr>
+            <w:r>
+              <w:rPr>
+                <w:sz w:val="21"/>
+              </w:rPr>
+              <w:t>Wait 60 seconds before response headers, allowing a client's shorter timeout to expire.</w:t>
+            </w:r>
+          </w:p>
+        </w:tc>
+      </w:tr>
+      <w:tr>
+        <w:trPr>
+          <w:cantSplit/>
+          <w:jc w:val="center"/>
+        </w:trPr>
+        <w:tc>
+          <w:tcPr>
+            <w:tcW w:w="2700" w:type="dxa"/>
+            <w:tcMar>
+              <w:top w:w="85" w:type="dxa"/>
+              <w:left w:w="85" w:type="dxa"/>
+              <w:bottom w:w="85" w:type="dxa"/>
+              <w:right w:w="85" w:type="dxa"/>
+            </w:tcMar>
+            <w:vAlign w:val="center"/>
+          </w:tcPr>
+          <w:p>
+            <w:pPr>
+              <w:spacing w:after="40" w:line="252" w:lineRule="auto"/>
+            </w:pPr>
+            <w:r>
+              <w:rPr>
+                <w:sz w:val="21"/>
+              </w:rPr>
+              <w:t>Stalled body</w:t>
+            </w:r>
+          </w:p>
+        </w:tc>
+        <w:tc>
+          <w:tcPr>
+            <w:tcW w:w="6300" w:type="dxa"/>
+            <w:tcMar>
+              <w:top w:w="85" w:type="dxa"/>
+              <w:left w:w="85" w:type="dxa"/>
+              <w:bottom w:w="85" w:type="dxa"/>
+              <w:right w:w="85" w:type="dxa"/>
+            </w:tcMar>
+            <w:vAlign w:val="center"/>
+          </w:tcPr>
+          <w:p>
+            <w:pPr>
+              <w:spacing w:after="40" w:line="252" w:lineRule="auto"/>
+            </w:pPr>
+            <w:r>
+              <w:rPr>
+                <w:sz w:val="21"/>
+              </w:rPr>
+              <w:t>Send headers then hold body delivery; test incomplete or stalled transfers.</w:t>
+            </w:r>
+          </w:p>
+        </w:tc>
+      </w:tr>
+      <w:tr>
+        <w:trPr>
+          <w:cantSplit/>
+          <w:jc w:val="center"/>
+        </w:trPr>
+        <w:tc>
+          <w:tcPr>
+            <w:tcW w:w="2700" w:type="dxa"/>
+            <w:tcMar>
+              <w:top w:w="85" w:type="dxa"/>
+              <w:left w:w="85" w:type="dxa"/>
+              <w:bottom w:w="85" w:type="dxa"/>
+              <w:right w:w="85" w:type="dxa"/>
+            </w:tcMar>
+            <w:vAlign w:val="center"/>
+          </w:tcPr>
+          <w:p>
+            <w:pPr>
+              <w:spacing w:after="40" w:line="252" w:lineRule="auto"/>
+            </w:pPr>
+            <w:r>
+              <w:rPr>
+                <w:sz w:val="21"/>
+              </w:rPr>
+              <w:t>Disconnect</w:t>
+            </w:r>
+          </w:p>
+        </w:tc>
+        <w:tc>
+          <w:tcPr>
+            <w:tcW w:w="6300" w:type="dxa"/>
+            <w:tcMar>
+              <w:top w:w="85" w:type="dxa"/>
+              <w:left w:w="85" w:type="dxa"/>
+              <w:bottom w:w="85" w:type="dxa"/>
+              <w:right w:w="85" w:type="dxa"/>
+            </w:tcMar>
+            <w:vAlign w:val="center"/>
+          </w:tcPr>
+          <w:p>
+            <w:pPr>
+              <w:spacing w:after="40" w:line="252" w:lineRule="auto"/>
+            </w:pPr>
+            <w:r>
+              <w:rPr>
+                <w:sz w:val="21"/>
+              </w:rPr>
+              <w:t>Break body delivery; test handling of an interrupted response.</w:t>
+            </w:r>
+          </w:p>
+        </w:tc>
+      </w:tr>
+      <w:tr>
+        <w:trPr>
+          <w:cantSplit/>
+          <w:jc w:val="center"/>
+        </w:trPr>
+        <w:tc>
+          <w:tcPr>
+            <w:tcW w:w="2700" w:type="dxa"/>
+            <w:tcMar>
+              <w:top w:w="85" w:type="dxa"/>
+              <w:left w:w="85" w:type="dxa"/>
+              <w:bottom w:w="85" w:type="dxa"/>
+              <w:right w:w="85" w:type="dxa"/>
+            </w:tcMar>
+            <w:vAlign w:val="center"/>
+          </w:tcPr>
+          <w:p>
+            <w:pPr>
+              <w:spacing w:after="40" w:line="252" w:lineRule="auto"/>
+            </w:pPr>
+            <w:r>
+              <w:rPr>
+                <w:sz w:val="21"/>
+              </w:rPr>
+              <w:t>HTTP status injection</w:t>
+            </w:r>
+          </w:p>
+        </w:tc>
+        <w:tc>
+          <w:tcPr>
+            <w:tcW w:w="6300" w:type="dxa"/>
+            <w:tcMar>
+              <w:top w:w="85" w:type="dxa"/>
+              <w:left w:w="85" w:type="dxa"/>
+              <w:bottom w:w="85" w:type="dxa"/>
+              <w:right w:w="85" w:type="dxa"/>
+            </w:tcMar>
+            <w:vAlign w:val="center"/>
+          </w:tcPr>
+          <w:p>
+            <w:pPr>
+              <w:spacing w:after="40" w:line="252" w:lineRule="auto"/>
+            </w:pPr>
+            <w:r>
+              <w:rPr>
+                <w:sz w:val="21"/>
+              </w:rPr>
+              <w:t>Return an error status from 400 to 599 for a path prefix at a configured probability; for example, HTTP 503 at 100%.</w:t>
+            </w:r>
+          </w:p>
+        </w:tc>
+      </w:tr>
+      <w:tr>
+        <w:trPr>
+          <w:cantSplit/>
+          <w:jc w:val="center"/>
+        </w:trPr>
+        <w:tc>
+          <w:tcPr>
+            <w:tcW w:w="2700" w:type="dxa"/>
+            <w:tcMar>
+              <w:top w:w="85" w:type="dxa"/>
+              <w:left w:w="85" w:type="dxa"/>
+              <w:bottom w:w="85" w:type="dxa"/>
+              <w:right w:w="85" w:type="dxa"/>
+            </w:tcMar>
+            <w:vAlign w:val="center"/>
+          </w:tcPr>
+          <w:p>
+            <w:pPr>
+              <w:spacing w:after="40" w:line="252" w:lineRule="auto"/>
+            </w:pPr>
+            <w:r>
+              <w:rPr>
+                <w:sz w:val="21"/>
+              </w:rPr>
+              <w:t>Response header controls</w:t>
+            </w:r>
+          </w:p>
+        </w:tc>
+        <w:tc>
+          <w:tcPr>
+            <w:tcW w:w="6300" w:type="dxa"/>
+            <w:tcMar>
+              <w:top w:w="85" w:type="dxa"/>
+              <w:left w:w="85" w:type="dxa"/>
+              <w:bottom w:w="85" w:type="dxa"/>
+              <w:right w:w="85" w:type="dxa"/>
+            </w:tcMar>
+            <w:vAlign w:val="center"/>
+          </w:tcPr>
+          <w:p>
+            <w:pPr>
+              <w:spacing w:after="40" w:line="252" w:lineRule="auto"/>
+            </w:pPr>
+            <w:r>
+              <w:rPr>
+                <w:sz w:val="21"/>
+              </w:rPr>
+              <w:t>Strip CORS or cache headers, or mismatch Content-Type, to inspect client handling.</w:t>
+            </w:r>
+          </w:p>
+        </w:tc>
+      </w:tr>
+      <w:tr>
+        <w:trPr>
+          <w:cantSplit/>
+          <w:jc w:val="center"/>
+        </w:trPr>
+        <w:tc>
+          <w:tcPr>
+            <w:tcW w:w="2700" w:type="dxa"/>
+            <w:tcMar>
+              <w:top w:w="85" w:type="dxa"/>
+              <w:left w:w="85" w:type="dxa"/>
+              <w:bottom w:w="85" w:type="dxa"/>
+              <w:right w:w="85" w:type="dxa"/>
+            </w:tcMar>
+            <w:vAlign w:val="center"/>
+          </w:tcPr>
+          <w:p>
+            <w:pPr>
+              <w:spacing w:after="40" w:line="252" w:lineRule="auto"/>
+            </w:pPr>
+            <w:r>
+              <w:rPr>
+                <w:sz w:val="21"/>
+              </w:rPr>
+              <w:t>JSON response mocks</w:t>
+            </w:r>
+          </w:p>
+        </w:tc>
+        <w:tc>
+          <w:tcPr>
+            <w:tcW w:w="6300" w:type="dxa"/>
+            <w:tcMar>
+              <w:top w:w="85" w:type="dxa"/>
+              <w:left w:w="85" w:type="dxa"/>
+              <w:bottom w:w="85" w:type="dxa"/>
+              <w:right w:w="85" w:type="dxa"/>
+            </w:tcMar>
+            <w:vAlign w:val="center"/>
+          </w:tcPr>
+          <w:p>
+            <w:pPr>
+              <w:spacing w:after="40" w:line="252" w:lineRule="auto"/>
+            </w:pPr>
+            <w:r>
+              <w:rPr>
+                <w:sz w:val="21"/>
+              </w:rPr>
+              <w:t>Return configured local JSON without contacting upstream; status rules take precedence over mocks.</w:t>
+            </w:r>
+          </w:p>
+        </w:tc>
+      </w:tr>
+    </w:tbl>
+    <w:p>
+      <w:pPr>
+        <w:keepNext/>
+        <w:spacing w:after="0" w:line="240" w:lineRule="auto"/>
+      </w:pPr>
+    </w:p>
+    <w:p>
+      <w:pPr>
+        <w:jc w:val="both"/>
+      </w:pPr>
+      <w:r>
+        <w:t>Send sample issues a GET through the applied configuration with a five-second client ceiling. The monitor shows finished request status, elapsed time, delivered bytes, outcome and applied effects, together with duration bars and aggregate counts. Filters show all, altered, error/cancelled or clean traffic. Clear monitor empties the rolling memory window without resetting settings.</w:t>
+      </w:r>
+    </w:p>
+    <w:p>
+      <w:pPr>
+        <w:jc w:val="both"/>
+      </w:pPr>
+      <w:r>
+        <w:t>Reset faults removes effects and rules, discards drafts and cancels active live requests while retaining applied targets and routes. Configuration and monitoring survive a page refresh but reset when Node restarts. Named network profiles are illustrative settings, not measured mobile-carrier behavior. Neither dashboard injects an IP packet-loss percentage or changes the laptop's physical routing; these controls act on proxied HTTP exchanges.</w:t>
+      </w:r>
+    </w:p>
+    <w:p>
+      <w:pPr>
         <w:pStyle w:val="Heading1"/>
         <w:pageBreakBefore/>
       </w:pPr>
-      <w:bookmarkStart w:id="6" w:name="_Toc242904055"/>
+      <w:bookmarkStart w:id="10" w:name="_Toc242906129"/>
       <w:r>
         <w:lastRenderedPageBreak/>
         <w:t>7. Modules Explanation</w:t>
       </w:r>
-      <w:bookmarkEnd w:id="6"/>
+      <w:bookmarkEnd w:id="10"/>
     </w:p>
     <w:tbl>
       <w:tblPr>
@@ -3515,22 +5384,22 @@
         <w:pageBreakBefore/>
         <w:spacing w:before="160"/>
       </w:pPr>
-      <w:bookmarkStart w:id="7" w:name="_Toc242904056"/>
+      <w:bookmarkStart w:id="11" w:name="_Toc242906130"/>
       <w:r>
         <w:lastRenderedPageBreak/>
         <w:t>8. Project Implementation</w:t>
       </w:r>
-      <w:bookmarkEnd w:id="7"/>
+      <w:bookmarkEnd w:id="11"/>
     </w:p>
     <w:p>
       <w:pPr>
         <w:pStyle w:val="Heading2"/>
       </w:pPr>
-      <w:bookmarkStart w:id="8" w:name="_Toc242904057"/>
+      <w:bookmarkStart w:id="12" w:name="_Toc242906131"/>
       <w:r>
         <w:t>8.1 Experimental Setup and Requirements</w:t>
       </w:r>
-      <w:bookmarkEnd w:id="8"/>
+      <w:bookmarkEnd w:id="12"/>
     </w:p>
     <w:tbl>
       <w:tblPr>
@@ -4032,13 +5901,29 @@
     </w:p>
     <w:p>
       <w:pPr>
+        <w:spacing w:before="120" w:after="160"/>
+      </w:pPr>
+      <w:r>
+        <w:t xml:space="preserve">Project repository: </w:t>
+      </w:r>
+      <w:hyperlink r:id="rId9">
+        <w:r>
+          <w:rPr>
+            <w:u w:val="single"/>
+          </w:rPr>
+          <w:t>https://github.com/Pranav-Suresh1024/FaultNet</w:t>
+        </w:r>
+      </w:hyperlink>
+    </w:p>
+    <w:p>
+      <w:pPr>
         <w:pStyle w:val="Heading2"/>
       </w:pPr>
-      <w:bookmarkStart w:id="9" w:name="_Toc242904058"/>
+      <w:bookmarkStart w:id="13" w:name="_Toc242906132"/>
       <w:r>
         <w:t>8.2 Test Cases</w:t>
       </w:r>
-      <w:bookmarkEnd w:id="9"/>
+      <w:bookmarkEnd w:id="13"/>
     </w:p>
     <w:tbl>
       <w:tblPr>
@@ -4746,12 +6631,12 @@
         <w:pageBreakBefore/>
         <w:spacing w:before="160"/>
       </w:pPr>
-      <w:bookmarkStart w:id="10" w:name="_Toc242904059"/>
+      <w:bookmarkStart w:id="14" w:name="_Toc242906133"/>
       <w:r>
         <w:lastRenderedPageBreak/>
         <w:t>8.3 Execution Results</w:t>
       </w:r>
-      <w:bookmarkEnd w:id="10"/>
+      <w:bookmarkEnd w:id="14"/>
     </w:p>
     <w:p>
       <w:pPr>
@@ -5235,12 +7120,12 @@
         <w:pStyle w:val="Heading2"/>
         <w:pageBreakBefore/>
       </w:pPr>
-      <w:bookmarkStart w:id="11" w:name="_Toc242904060"/>
+      <w:bookmarkStart w:id="15" w:name="_Toc242906134"/>
       <w:r>
         <w:lastRenderedPageBreak/>
         <w:t>8.4 Performance Analysis and Routing Comparison</w:t>
       </w:r>
-      <w:bookmarkEnd w:id="11"/>
+      <w:bookmarkEnd w:id="15"/>
     </w:p>
     <w:p>
       <w:pPr>
@@ -5742,11 +7627,11 @@
       <w:pPr>
         <w:pStyle w:val="Heading2"/>
       </w:pPr>
-      <w:bookmarkStart w:id="12" w:name="_Toc242904061"/>
+      <w:bookmarkStart w:id="16" w:name="_Toc242906135"/>
       <w:r>
         <w:t>8.5 Critical Evaluation and Optimization</w:t>
       </w:r>
-      <w:bookmarkEnd w:id="12"/>
+      <w:bookmarkEnd w:id="16"/>
     </w:p>
     <w:p>
       <w:pPr>
@@ -5769,22 +7654,22 @@
         <w:pStyle w:val="Heading1"/>
         <w:pageBreakBefore/>
       </w:pPr>
-      <w:bookmarkStart w:id="13" w:name="_Toc242904062"/>
+      <w:bookmarkStart w:id="17" w:name="_Toc242906136"/>
       <w:r>
         <w:lastRenderedPageBreak/>
         <w:t>9. Results and Discussion</w:t>
       </w:r>
-      <w:bookmarkEnd w:id="13"/>
+      <w:bookmarkEnd w:id="17"/>
     </w:p>
     <w:p>
       <w:pPr>
         <w:pStyle w:val="Heading2"/>
       </w:pPr>
-      <w:bookmarkStart w:id="14" w:name="_Toc242904063"/>
+      <w:bookmarkStart w:id="18" w:name="_Toc242906137"/>
       <w:r>
         <w:t>9.1 Findings and Inferences</w:t>
       </w:r>
-      <w:bookmarkEnd w:id="14"/>
+      <w:bookmarkEnd w:id="18"/>
     </w:p>
     <w:p>
       <w:pPr>
@@ -5806,11 +7691,11 @@
       <w:pPr>
         <w:pStyle w:val="Heading2"/>
       </w:pPr>
-      <w:bookmarkStart w:id="15" w:name="_Toc242904064"/>
+      <w:bookmarkStart w:id="19" w:name="_Toc242906138"/>
       <w:r>
         <w:t>9.2 Innovation and Evidence</w:t>
       </w:r>
-      <w:bookmarkEnd w:id="15"/>
+      <w:bookmarkEnd w:id="19"/>
     </w:p>
     <w:p>
       <w:pPr>
@@ -5824,11 +7709,11 @@
       <w:pPr>
         <w:pStyle w:val="Heading1"/>
       </w:pPr>
-      <w:bookmarkStart w:id="16" w:name="_Toc242904065"/>
+      <w:bookmarkStart w:id="20" w:name="_Toc242906139"/>
       <w:r>
         <w:t>10. Conclusion</w:t>
       </w:r>
-      <w:bookmarkEnd w:id="16"/>
+      <w:bookmarkEnd w:id="20"/>
     </w:p>
     <w:p>
       <w:pPr>
@@ -5842,11 +7727,11 @@
       <w:pPr>
         <w:pStyle w:val="Heading1"/>
       </w:pPr>
-      <w:bookmarkStart w:id="17" w:name="_Toc242904066"/>
+      <w:bookmarkStart w:id="21" w:name="_Toc242906140"/>
       <w:r>
         <w:t>11. Limitations and Future Enhancements</w:t>
       </w:r>
-      <w:bookmarkEnd w:id="17"/>
+      <w:bookmarkEnd w:id="21"/>
     </w:p>
     <w:p>
       <w:pPr>
@@ -5874,7 +7759,7 @@
     </w:p>
     <w:p/>
     <w:sectPr>
-      <w:footerReference w:type="default" r:id="rId9"/>
+      <w:footerReference w:type="default" r:id="rId10"/>
       <w:pgSz w:w="11909" w:h="16834"/>
       <w:pgMar w:top="1224" w:right="1368" w:bottom="1224" w:left="1368" w:header="720" w:footer="576" w:gutter="0"/>
       <w:cols w:space="720"/>

</xml_diff>

<commit_message>
Complete measured final project report and handoff
</commit_message>
<xml_diff>
--- a/docs/reports/FaultNet-partial-report.docx
+++ b/docs/reports/FaultNet-partial-report.docx
@@ -171,7 +171,13 @@
         <w:t>us</w:t>
       </w:r>
       <w:r>
-        <w:t xml:space="preserve">, for the BCSE308P - Computer Networks to VIT is a record of bonafide work carried out by </w:t>
+        <w:t xml:space="preserve">, for the BCSE308P - Computer Networks to VIT is a record of </w:t>
+      </w:r>
+      <w:r>
+        <w:t>Bonafide</w:t>
+      </w:r>
+      <w:r>
+        <w:t xml:space="preserve"> work carried out by </w:t>
       </w:r>
       <w:r>
         <w:t>us</w:t>
@@ -1487,15 +1493,7 @@
             <w:rStyle w:val="Hyperlink"/>
             <w:noProof/>
           </w:rPr>
-          <w:t>9. R</w:t>
-        </w:r>
-        <w:r>
-          <w:rPr>
-            <w:rStyle w:val="Hyperlink"/>
-            <w:noProof/>
-          </w:rPr>
-          <w:lastRenderedPageBreak/>
-          <w:t>esults and Discussion</w:t>
+          <w:t>9. Results and Discussion</w:t>
         </w:r>
         <w:r>
           <w:rPr>
@@ -1837,6 +1835,7 @@
         <w:pageBreakBefore/>
       </w:pPr>
       <w:r>
+        <w:lastRenderedPageBreak/>
         <w:fldChar w:fldCharType="end"/>
       </w:r>
       <w:bookmarkStart w:id="0" w:name="_Toc242906119"/>
@@ -1876,10 +1875,7 @@
         <w:jc w:val="both"/>
       </w:pPr>
       <w:r>
-        <w:t>FaultNet can support development testing of registration portals and checkout interfaces under delayed responses or HTTP errors, download clients under restricted bandwidth or interrupted transfers, and mobile interfaces under variable delay and delivery rates. JSON mocks allow a frontend to be exercised before its backend is available. In a networking laboratory, the workbench supports repeatable fault and recovery experiments with packet evidence. These are potential uses of the implemented controls; they</w:t>
-      </w:r>
-      <w:r>
-        <w:t xml:space="preserve"> are not claims of completed deployments. Developers must route the intended development requests through the live proxy and implement any fixes exposed by testing.</w:t>
+        <w:t>FaultNet can support development testing of registration portals and checkout interfaces under delayed responses or HTTP errors, download clients under restricted bandwidth or interrupted transfers, and mobile interfaces under variable delay and delivery rates. JSON mocks allow a frontend to be exercised before its backend is available. In a networking laboratory, the workbench supports repeatable fault and recovery experiments with packet evidence. These are potential uses of the implemented controls; they are not claims of completed deployments. Developers must route the intended development requests through the live proxy and implement any fixes exposed by testing.</w:t>
       </w:r>
     </w:p>
     <w:p>
@@ -3094,7 +3090,13 @@
         <w:jc w:val="both"/>
       </w:pPr>
       <w:r>
-        <w:t>Responses return through the proxy to the requesting client. The runner controls fault state and records observations; the browser obtains records through the control API. The browser does not read the results directory directly.</w:t>
+        <w:t xml:space="preserve">Responses return through the proxy to the requesting client. The runner </w:t>
+      </w:r>
+      <w:r>
+        <w:t>control’s</w:t>
+      </w:r>
+      <w:r>
+        <w:t xml:space="preserve"> fault state and records observations; the browser obtains records through the control API. The browser does not read the results directory directly.</w:t>
       </w:r>
     </w:p>
     <w:p>
@@ -4102,10 +4104,7 @@
         <w:jc w:val="both"/>
       </w:pPr>
       <w:r>
-        <w:t>Start experiment launches the run; Stop cancels active work and initiates fault clearance. Refresh updates service and record information. Auto, baseline, faulty and recovery selections determine the statistics under inspection. Availability, mean, median, p95, minimum, maximum, goodput and baseline changes are accompanied by phase counts and exact probe measurements. Charts show phase medians, attempt durations, successful-response distributions and outcome counts. Missing successful samples remain unavail</w:t>
-      </w:r>
-      <w:r>
-        <w:t>able rather than becoming zero.</w:t>
+        <w:t>Start experiment launches the run; Stop cancels active work and initiates fault clearance. Refresh updates service and record information. Auto, baseline, faulty and recovery selections determine the statistics under inspection. Availability, mean, median, p95, minimum, maximum, goodput and baseline changes are accompanied by phase counts and exact probe measurements. Charts show phase medians, attempt durations, successful-response distributions and outcome counts. Missing successful samples remain unavailable rather than becoming zero.</w:t>
       </w:r>
     </w:p>
     <w:p>
@@ -4133,7 +4132,13 @@
         <w:jc w:val="both"/>
       </w:pPr>
       <w:r>
-        <w:t>The cockpit forwards development traffic through port 8080. Unified routing selects one application origin; split routing selects frontend or backend origins using configured backend path prefixes. Requests must pass through that entry to receive the applied effects. The default demo exposes /payload. Presets and sliders edit a draft, Apply changes activates it for subsequent requests, and Reload applied retrieves the current configuration.</w:t>
+        <w:t xml:space="preserve">The cockpit forwards development traffic through port 8080. Unified routing selects one application origin; split routing selects frontend or backend origins using configured backend path prefixes. Requests must pass through that entry to receive the applied effects. The default demo exposes /payload. Presets and sliders edit a draft, </w:t>
+      </w:r>
+      <w:r>
+        <w:t>apply</w:t>
+      </w:r>
+      <w:r>
+        <w:t xml:space="preserve"> changes activates it for subsequent requests, and Reload applied retrieves the current configuration.</w:t>
       </w:r>
     </w:p>
     <w:tbl>
@@ -5904,7 +5909,14 @@
         <w:spacing w:before="120" w:after="160"/>
       </w:pPr>
       <w:r>
-        <w:t xml:space="preserve">Project repository: </w:t>
+        <w:rPr>
+          <w:i/>
+          <w:iCs/>
+        </w:rPr>
+        <w:t>Project repository:</w:t>
+      </w:r>
+      <w:r>
+        <w:t xml:space="preserve"> </w:t>
       </w:r>
       <w:hyperlink r:id="rId9">
         <w:r>
@@ -6643,7 +6655,13 @@
         <w:jc w:val="both"/>
       </w:pPr>
       <w:r>
-        <w:t>The following are previously documented observations, not new final-submission experiments. Common application settings were two probes per baseline/fault phase, 100 ms interval and 5000 ms timeout. Recovery required three consecutive successes. The results are drawn from the committed verification summary</w:t>
+        <w:t xml:space="preserve">The following are previously documented observations, not new final-submission experiments. Common application settings were two probes per baseline/fault phase, 100 ms interval and 5000 ms </w:t>
+      </w:r>
+      <w:r>
+        <w:t>timeouts</w:t>
+      </w:r>
+      <w:r>
+        <w:t>. Recovery required three consecutive successes. The results are drawn from the committed verification summary</w:t>
       </w:r>
       <w:r>
         <w:t>.</w:t>

</xml_diff>